<commit_message>
CV sidebar: fix missing <w:document> root element — template now opens in Word
The script extracted docOpenTag by finding the first '>' in the XML, which
captured only the <?xml ...?> processing instruction and completely missed
the <w:document xmlns:...> opening tag. The generated docx had a closing
</w:document> with no matching open element — invalid XML that crashed Word.

Fixed by taking everything before <w:body as the document prefix, which
correctly captures both the XML declaration and the full <w:document>
element with all namespace declarations.

Co-Authored-By: Claude Sonnet 4.6 <noreply@anthropic.com>
</commit_message>
<xml_diff>
--- a/backend/templates/cv_sidebar_blue_placeholders.docx
+++ b/backend/templates/cv_sidebar_blue_placeholders.docx
@@ -1,5 +1,788 @@
 
-<file path=word/document.xml><?xml version="1.0" encoding="UTF-8" standalone="yes"?><w:body><w:tbl><w:tblPr><w:tblW w:w="5000" w:type="pct"/><w:tblBorders><w:top w:val="none" w:sz="0" w:space="0" w:color="auto"/><w:left w:val="none" w:sz="0" w:space="0" w:color="auto"/><w:bottom w:val="none" w:sz="0" w:space="0" w:color="auto"/><w:right w:val="none" w:sz="0" w:space="0" w:color="auto"/><w:insideH w:val="none" w:sz="0" w:space="0" w:color="auto"/><w:insideV w:val="none" w:sz="0" w:space="0" w:color="auto"/></w:tblBorders><w:tblLook w:val="0000" w:firstRow="0" w:lastRow="0" w:firstColumn="0" w:lastColumn="0" w:noHBand="0" w:noVBand="0"/></w:tblPr><w:tblGrid><w:gridCol w:w="3203"/><w:gridCol w:w="6437"/></w:tblGrid><w:tr><w:trPr><w:trHeight w:val="100" w:hRule="atLeast"/></w:trPr><w:tc><w:tcPr><w:tcW w:w="1750" w:type="pct"/><w:shd w:val="clear" w:color="auto" w:fill="2B6CB0"/><w:tcMar><w:top w:w="0" w:type="dxa"/><w:left w:w="200" w:type="dxa"/><w:right w:w="200" w:type="dxa"/><w:bottom w:w="0" w:type="dxa"/></w:tcMar><w:vAlign w:val="top"/></w:tcPr><w:p><w:pPr><w:spacing w:before="240" w:after="120"/><w:jc w:val="center"/></w:pPr><w:r><w:rPr><w:noProof/></w:rPr><w:drawing><wp:inline distT="0" distB="0" distL="0" distR="0"><wp:extent cx="1440000" cy="1440000"/><wp:effectExtent l="0" t="0" r="0" b="0"/><wp:docPr id="201" name="EmployeePhoto"/><wp:cNvGraphicFramePr><a:graphicFrameLocks xmlns:a="http://schemas.openxmlformats.org/drawingml/2006/main" noChangeAspect="1"/></wp:cNvGraphicFramePr><a:graphic xmlns:a="http://schemas.openxmlformats.org/drawingml/2006/main"><a:graphicData uri="http://schemas.openxmlformats.org/drawingml/2006/picture"><pic:pic xmlns:pic="http://schemas.openxmlformats.org/drawingml/2006/picture"><pic:nvPicPr><pic:cNvPr id="0" name="EmployeePhoto"/><pic:cNvPicPr><a:picLocks noChangeAspect="1"/></pic:cNvPicPr></pic:nvPicPr><pic:blipFill><a:blip r:embed="rId_employee_photo"/><a:stretch><a:fillRect/></a:stretch></pic:blipFill><pic:spPr><a:xfrm><a:off x="0" y="0"/><a:ext cx="1440000" cy="1440000"/></a:xfrm><a:prstGeom prst="ellipse"><a:avLst/></a:prstGeom></pic:spPr></pic:pic></a:graphicData></a:graphic></wp:inline></w:drawing></w:r></w:p><w:p><w:pPr><w:spacing w:before="0" w:after="40"/><w:jc w:val="center"/><w:rPr><w:rFonts w:ascii="Calibri" w:hAnsi="Calibri" w:cs="Calibri"/><w:color w:val="FFFFFF"/><w:b/><w:bCs/><w:sz w:val="36"/><w:szCs w:val="36"/></w:rPr></w:pPr><w:r><w:rPr><w:rFonts w:ascii="Calibri" w:hAnsi="Calibri" w:cs="Calibri"/><w:color w:val="FFFFFF"/><w:b/><w:bCs/><w:sz w:val="36"/><w:szCs w:val="36"/></w:rPr><w:t xml:space="preserve">{firstName} {lastName}</w:t></w:r></w:p><w:p><w:pPr><w:spacing w:before="0" w:after="160"/><w:jc w:val="center"/><w:rPr><w:rFonts w:ascii="Calibri" w:hAnsi="Calibri" w:cs="Calibri"/><w:color w:val="FFFFFF"/><w:sz w:val="18"/><w:szCs w:val="18"/></w:rPr></w:pPr><w:r><w:rPr><w:rFonts w:ascii="Calibri" w:hAnsi="Calibri" w:cs="Calibri"/><w:color w:val="FFFFFF"/><w:sz w:val="18"/><w:szCs w:val="18"/></w:rPr><w:t xml:space="preserve">{department}</w:t></w:r></w:p><w:p><w:pPr><w:pBdr><w:bottom w:val="single" w:sz="4" w:space="1" w:color="FFFFFF"/></w:pBdr><w:spacing w:before="200" w:after="80"/><w:rPr><w:rFonts w:ascii="Calibri" w:hAnsi="Calibri" w:cs="Calibri"/><w:color w:val="FFFFFF"/><w:b/><w:bCs/><w:sz w:val="20"/><w:szCs w:val="20"/></w:rPr></w:pPr><w:r><w:rPr><w:rFonts w:ascii="Calibri" w:hAnsi="Calibri" w:cs="Calibri"/><w:color w:val="FFFFFF"/><w:b/><w:bCs/><w:sz w:val="20"/><w:szCs w:val="20"/></w:rPr><w:t xml:space="preserve">ΕΠΙΚΟΙΝΩΝΙΑ</w:t></w:r></w:p><w:p><w:pPr><w:spacing w:before="0" w:after="60"/><w:rPr><w:rFonts w:ascii="Calibri" w:hAnsi="Calibri" w:cs="Calibri"/><w:color w:val="FFFFFF"/><w:sz w:val="17"/><w:szCs w:val="17"/></w:rPr></w:pPr><w:r><w:rPr><w:rFonts w:ascii="Calibri" w:hAnsi="Calibri" w:cs="Calibri"/><w:color w:val="FFFFFF"/><w:sz w:val="17"/><w:szCs w:val="17"/></w:rPr><w:t xml:space="preserve">Τηλ: {phone}</w:t></w:r></w:p><w:p><w:pPr><w:spacing w:before="0" w:after="60"/><w:rPr><w:rFonts w:ascii="Calibri" w:hAnsi="Calibri" w:cs="Calibri"/><w:color w:val="FFFFFF"/><w:sz w:val="17"/><w:szCs w:val="17"/></w:rPr></w:pPr><w:r><w:rPr><w:rFonts w:ascii="Calibri" w:hAnsi="Calibri" w:cs="Calibri"/><w:color w:val="FFFFFF"/><w:sz w:val="17"/><w:szCs w:val="17"/></w:rPr><w:t xml:space="preserve">Email: {email}</w:t></w:r></w:p><w:p><w:pPr><w:spacing w:before="0" w:after="60"/><w:rPr><w:rFonts w:ascii="Calibri" w:hAnsi="Calibri" w:cs="Calibri"/><w:color w:val="FFFFFF"/><w:sz w:val="17"/><w:szCs w:val="17"/></w:rPr></w:pPr><w:r><w:rPr><w:rFonts w:ascii="Calibri" w:hAnsi="Calibri" w:cs="Calibri"/><w:color w:val="FFFFFF"/><w:sz w:val="17"/><w:szCs w:val="17"/></w:rPr><w:t xml:space="preserve">{homeAddress}</w:t></w:r></w:p><w:p><w:pPr><w:spacing w:before="0" w:after="60"/><w:rPr><w:rFonts w:ascii="Calibri" w:hAnsi="Calibri" w:cs="Calibri"/><w:color w:val="FFFFFF"/><w:sz w:val="17"/><w:szCs w:val="17"/></w:rPr></w:pPr><w:r><w:rPr><w:rFonts w:ascii="Calibri" w:hAnsi="Calibri" w:cs="Calibri"/><w:color w:val="FFFFFF"/><w:sz w:val="17"/><w:szCs w:val="17"/></w:rPr><w:t xml:space="preserve">Ημ/νία: {dateOfBirth}</w:t></w:r></w:p><w:p><w:pPr><w:spacing w:before="0" w:after="60"/><w:rPr><w:rFonts w:ascii="Calibri" w:hAnsi="Calibri" w:cs="Calibri"/><w:color w:val="FFFFFF"/><w:sz w:val="17"/><w:szCs w:val="17"/></w:rPr></w:pPr><w:r><w:rPr><w:rFonts w:ascii="Calibri" w:hAnsi="Calibri" w:cs="Calibri"/><w:color w:val="FFFFFF"/><w:sz w:val="17"/><w:szCs w:val="17"/></w:rPr><w:t xml:space="preserve">Τόπος: {placeOfBirth}</w:t></w:r></w:p><w:p><w:pPr><w:spacing w:before="0" w:after="80"/><w:rPr><w:rFonts w:ascii="Calibri" w:hAnsi="Calibri" w:cs="Calibri"/><w:color w:val="FFFFFF"/><w:sz w:val="17"/><w:szCs w:val="17"/></w:rPr></w:pPr></w:p><w:p><w:pPr><w:pBdr><w:bottom w:val="single" w:sz="4" w:space="1" w:color="FFFFFF"/></w:pBdr><w:spacing w:before="200" w:after="80"/><w:rPr><w:rFonts w:ascii="Calibri" w:hAnsi="Calibri" w:cs="Calibri"/><w:color w:val="FFFFFF"/><w:b/><w:bCs/><w:sz w:val="20"/><w:szCs w:val="20"/></w:rPr></w:pPr><w:r><w:rPr><w:rFonts w:ascii="Calibri" w:hAnsi="Calibri" w:cs="Calibri"/><w:color w:val="FFFFFF"/><w:b/><w:bCs/><w:sz w:val="20"/><w:szCs w:val="20"/></w:rPr><w:t xml:space="preserve">ΣΧΕΤΙΚΑ ΜΕ ΕΜΕΝΑ</w:t></w:r></w:p><w:p><w:pPr><w:spacing w:before="0" w:after="80"/><w:rPr><w:rFonts w:ascii="Calibri" w:hAnsi="Calibri" w:cs="Calibri"/><w:color w:val="FFFFFF"/><w:sz w:val="17"/><w:szCs w:val="17"/></w:rPr></w:pPr></w:p><w:p><w:pPr><w:spacing w:before="0" w:after="80"/><w:rPr><w:rFonts w:ascii="Calibri" w:hAnsi="Calibri" w:cs="Calibri"/><w:color w:val="FFFFFF"/><w:sz w:val="17"/><w:szCs w:val="17"/></w:rPr></w:pPr></w:p><w:p><w:pPr><w:spacing w:before="0" w:after="80"/><w:rPr><w:rFonts w:ascii="Calibri" w:hAnsi="Calibri" w:cs="Calibri"/><w:color w:val="FFFFFF"/><w:sz w:val="17"/><w:szCs w:val="17"/></w:rPr></w:pPr></w:p><w:p><w:pPr><w:spacing w:before="0" w:after="80"/><w:rPr><w:rFonts w:ascii="Calibri" w:hAnsi="Calibri" w:cs="Calibri"/><w:color w:val="FFFFFF"/><w:sz w:val="17"/><w:szCs w:val="17"/></w:rPr></w:pPr></w:p><w:p><w:pPr><w:pBdr><w:bottom w:val="single" w:sz="4" w:space="1" w:color="FFFFFF"/></w:pBdr><w:spacing w:before="200" w:after="80"/><w:rPr><w:rFonts w:ascii="Calibri" w:hAnsi="Calibri" w:cs="Calibri"/><w:color w:val="FFFFFF"/><w:b/><w:bCs/><w:sz w:val="20"/><w:szCs w:val="20"/></w:rPr></w:pPr><w:r><w:rPr><w:rFonts w:ascii="Calibri" w:hAnsi="Calibri" w:cs="Calibri"/><w:color w:val="FFFFFF"/><w:b/><w:bCs/><w:sz w:val="20"/><w:szCs w:val="20"/></w:rPr><w:t xml:space="preserve">ΓΝΩΣΕΙΣ</w:t></w:r></w:p><w:p><w:pPr><w:spacing w:before="0" w:after="0"/></w:pPr><w:r><w:t>{#skillRows}</w:t></w:r></w:p><w:p><w:pPr><w:spacing w:before="0" w:after="60"/><w:rPr><w:rFonts w:ascii="Calibri" w:hAnsi="Calibri" w:cs="Calibri"/><w:color w:val="FFFFFF"/><w:sz w:val="17"/><w:szCs w:val="17"/></w:rPr></w:pPr><w:r><w:rPr><w:rFonts w:ascii="Calibri" w:hAnsi="Calibri" w:cs="Calibri"/><w:color w:val="FFFFFF"/><w:sz w:val="17"/><w:szCs w:val="17"/></w:rPr><w:t xml:space="preserve">• {skillText}</w:t></w:r></w:p><w:p><w:pPr><w:spacing w:before="0" w:after="0"/></w:pPr><w:r><w:t>{/skillRows}</w:t></w:r></w:p></w:tc><w:tc><w:tcPr><w:tcW w:w="3250" w:type="pct"/><w:shd w:val="clear" w:color="auto" w:fill="FFFFFF"/><w:tcMar><w:top w:w="200" w:type="dxa"/><w:left w:w="300" w:type="dxa"/><w:right w:w="200" w:type="dxa"/><w:bottom w:w="0" w:type="dxa"/></w:tcMar><w:vAlign w:val="top"/></w:tcPr><w:p><w:pPr><w:pBdr><w:bottom w:val="single" w:sz="6" w:space="1" w:color="2B6CB0"/></w:pBdr><w:spacing w:before="280" w:after="80"/><w:rPr><w:rFonts w:ascii="Calibri" w:hAnsi="Calibri" w:cs="Calibri"/><w:color w:val="2B6CB0"/><w:b/><w:bCs/><w:sz w:val="24"/><w:szCs w:val="24"/></w:rPr></w:pPr><w:r><w:rPr><w:rFonts w:ascii="Calibri" w:hAnsi="Calibri" w:cs="Calibri"/><w:color w:val="2B6CB0"/><w:b/><w:bCs/><w:sz w:val="24"/><w:szCs w:val="24"/></w:rPr><w:t xml:space="preserve">ΕΚΠΑΙΔΕΥΣΗ</w:t></w:r></w:p><w:p><w:pPr><w:spacing w:before="0" w:after="0"/></w:pPr><w:r><w:t>{#educationOnlyRows}</w:t></w:r></w:p><w:p><w:pPr><w:spacing w:before="100" w:after="0"/><w:rPr><w:rFonts w:ascii="Calibri" w:hAnsi="Calibri" w:cs="Calibri"/><w:color w:val="1A202C"/><w:b/><w:bCs/><w:sz w:val="20"/><w:szCs w:val="20"/></w:rPr></w:pPr><w:r><w:rPr><w:rFonts w:ascii="Calibri" w:hAnsi="Calibri" w:cs="Calibri"/><w:color w:val="1A202C"/><w:b/><w:bCs/><w:sz w:val="20"/><w:szCs w:val="20"/></w:rPr><w:t xml:space="preserve">{institutionFull}</w:t></w:r></w:p><w:p><w:pPr><w:spacing w:before="0" w:after="0"/><w:rPr><w:rFonts w:ascii="Calibri" w:hAnsi="Calibri" w:cs="Calibri"/><w:color w:val="2B6CB0"/><w:i/><w:iCs/><w:sz w:val="18"/><w:szCs w:val="18"/></w:rPr></w:pPr><w:r><w:rPr><w:rFonts w:ascii="Calibri" w:hAnsi="Calibri" w:cs="Calibri"/><w:color w:val="2B6CB0"/><w:i/><w:iCs/><w:sz w:val="18"/><w:szCs w:val="18"/></w:rPr><w:t xml:space="preserve">{degreeTitle}</w:t></w:r></w:p><w:p><w:pPr><w:spacing w:before="0" w:after="0"/><w:rPr><w:rFonts w:ascii="Calibri" w:hAnsi="Calibri" w:cs="Calibri"/><w:color w:val="718096"/><w:sz w:val="18"/><w:szCs w:val="18"/></w:rPr></w:pPr><w:r><w:rPr><w:rFonts w:ascii="Calibri" w:hAnsi="Calibri" w:cs="Calibri"/><w:color w:val="718096"/><w:sz w:val="18"/><w:szCs w:val="18"/></w:rPr><w:t xml:space="preserve">{degreeType}</w:t></w:r></w:p><w:p><w:pPr><w:spacing w:before="0" w:after="0"/><w:rPr><w:rFonts w:ascii="Calibri" w:hAnsi="Calibri" w:cs="Calibri"/><w:color w:val="718096"/><w:sz w:val="18"/><w:szCs w:val="18"/></w:rPr></w:pPr><w:r><w:rPr><w:rFonts w:ascii="Calibri" w:hAnsi="Calibri" w:cs="Calibri"/><w:color w:val="718096"/><w:sz w:val="18"/><w:szCs w:val="18"/></w:rPr><w:t xml:space="preserve">{specialization}</w:t></w:r></w:p><w:p><w:pPr><w:spacing w:before="0" w:after="0"/><w:rPr><w:rFonts w:ascii="Calibri" w:hAnsi="Calibri" w:cs="Calibri"/><w:color w:val="718096"/><w:sz w:val="18"/><w:szCs w:val="18"/></w:rPr></w:pPr><w:r><w:rPr><w:rFonts w:ascii="Calibri" w:hAnsi="Calibri" w:cs="Calibri"/><w:color w:val="718096"/><w:sz w:val="18"/><w:szCs w:val="18"/></w:rPr><w:t xml:space="preserve">{dateAwarded}</w:t></w:r></w:p><w:p><w:pPr><w:spacing w:before="0" w:after="80"/></w:pPr></w:p><w:p><w:pPr><w:spacing w:before="0" w:after="0"/></w:pPr><w:r><w:t>{/educationOnlyRows}</w:t></w:r></w:p><w:p><w:pPr><w:pBdr><w:bottom w:val="single" w:sz="6" w:space="1" w:color="2B6CB0"/></w:pBdr><w:spacing w:before="280" w:after="80"/><w:rPr><w:rFonts w:ascii="Calibri" w:hAnsi="Calibri" w:cs="Calibri"/><w:color w:val="2B6CB0"/><w:b/><w:bCs/><w:sz w:val="24"/><w:szCs w:val="24"/></w:rPr></w:pPr><w:r><w:rPr><w:rFonts w:ascii="Calibri" w:hAnsi="Calibri" w:cs="Calibri"/><w:color w:val="2B6CB0"/><w:b/><w:bCs/><w:sz w:val="24"/><w:szCs w:val="24"/></w:rPr><w:t xml:space="preserve">ΕΠΑΓΓΕΛΜΑΤΙΚΗ ΕΜΠΕΙΡΙΑ</w:t></w:r></w:p><w:p><w:pPr><w:spacing w:before="0" w:after="0"/></w:pPr><w:r><w:t>{#workExperienceRows}</w:t></w:r></w:p><w:p><w:pPr><w:spacing w:before="100" w:after="0"/><w:rPr><w:rFonts w:ascii="Calibri" w:hAnsi="Calibri" w:cs="Calibri"/><w:color w:val="1A202C"/><w:b/><w:bCs/><w:sz w:val="20"/><w:szCs w:val="20"/></w:rPr></w:pPr><w:r><w:rPr><w:rFonts w:ascii="Calibri" w:hAnsi="Calibri" w:cs="Calibri"/><w:color w:val="1A202C"/><w:b/><w:bCs/><w:sz w:val="20"/><w:szCs w:val="20"/></w:rPr><w:t xml:space="preserve">{employerName}</w:t></w:r></w:p><w:p><w:pPr><w:spacing w:before="0" w:after="0"/><w:rPr><w:rFonts w:ascii="Calibri" w:hAnsi="Calibri" w:cs="Calibri"/><w:color w:val="2B6CB0"/><w:i/><w:iCs/><w:sz w:val="18"/><w:szCs w:val="18"/></w:rPr></w:pPr><w:r><w:rPr><w:rFonts w:ascii="Calibri" w:hAnsi="Calibri" w:cs="Calibri"/><w:color w:val="2B6CB0"/><w:i/><w:iCs/><w:sz w:val="18"/><w:szCs w:val="18"/></w:rPr><w:t xml:space="preserve">{projectText}</w:t></w:r></w:p><w:p><w:pPr><w:spacing w:before="0" w:after="0"/><w:rPr><w:rFonts w:ascii="Calibri" w:hAnsi="Calibri" w:cs="Calibri"/><w:color w:val="718096"/><w:sz w:val="18"/><w:szCs w:val="18"/></w:rPr></w:pPr><w:r><w:rPr><w:rFonts w:ascii="Calibri" w:hAnsi="Calibri" w:cs="Calibri"/><w:color w:val="718096"/><w:sz w:val="18"/><w:szCs w:val="18"/></w:rPr><w:t xml:space="preserve">{roleName}</w:t></w:r></w:p><w:p><w:pPr><w:spacing w:before="0" w:after="0"/><w:rPr><w:rFonts w:ascii="Calibri" w:hAnsi="Calibri" w:cs="Calibri"/><w:color w:val="718096"/><w:sz w:val="18"/><w:szCs w:val="18"/></w:rPr></w:pPr><w:r><w:rPr><w:rFonts w:ascii="Calibri" w:hAnsi="Calibri" w:cs="Calibri"/><w:color w:val="718096"/><w:sz w:val="18"/><w:szCs w:val="18"/></w:rPr><w:t xml:space="preserve">{period}</w:t></w:r></w:p><w:p><w:pPr><w:spacing w:before="0" w:after="80"/></w:pPr></w:p><w:p><w:pPr><w:spacing w:before="0" w:after="0"/></w:pPr><w:r><w:t>{/workExperienceRows}</w:t></w:r></w:p><w:p><w:pPr><w:spacing w:before="0" w:after="0"/></w:pPr><w:r><w:t>{#hasPublications}</w:t></w:r></w:p><w:p><w:pPr><w:pBdr><w:bottom w:val="single" w:sz="6" w:space="1" w:color="2B6CB0"/></w:pBdr><w:spacing w:before="280" w:after="80"/><w:rPr><w:rFonts w:ascii="Calibri" w:hAnsi="Calibri" w:cs="Calibri"/><w:color w:val="2B6CB0"/><w:b/><w:bCs/><w:sz w:val="24"/><w:szCs w:val="24"/></w:rPr></w:pPr><w:r><w:rPr><w:rFonts w:ascii="Calibri" w:hAnsi="Calibri" w:cs="Calibri"/><w:color w:val="2B6CB0"/><w:b/><w:bCs/><w:sz w:val="24"/><w:szCs w:val="24"/></w:rPr><w:t xml:space="preserve">ΔΗΜΟΣΙΕΥΣΕΙΣ</w:t></w:r></w:p><w:p><w:pPr><w:spacing w:before="0" w:after="0"/><w:rPr><w:rFonts w:ascii="Calibri" w:hAnsi="Calibri" w:cs="Calibri"/><w:color w:val="718096"/><w:sz w:val="18"/><w:szCs w:val="18"/></w:rPr></w:pPr><w:r><w:rPr><w:rFonts w:ascii="Calibri" w:hAnsi="Calibri" w:cs="Calibri"/><w:color w:val="718096"/><w:sz w:val="18"/><w:szCs w:val="18"/></w:rPr><w:t xml:space="preserve">{publicationsText}</w:t></w:r></w:p><w:p><w:pPr><w:spacing w:before="0" w:after="0"/></w:pPr><w:r><w:t>{/hasPublications}</w:t></w:r></w:p><w:p><w:pPr><w:spacing w:before="0" w:after="80"/></w:pPr></w:p></w:tc></w:tr></w:tbl><w:sectPr><w:pgSz w:w="11906" w:h="16838"/><w:pgMar w:top="567" w:right="567" w:bottom="567" w:left="567" w:header="708" w:footer="708" w:gutter="0"/></w:sectPr></w:body></w:document>
+<file path=word/document.xml><?xml version="1.0" encoding="utf-8"?>
+<w:document xmlns:wpc="http://schemas.microsoft.com/office/word/2010/wordprocessingCanvas" xmlns:cx="http://schemas.microsoft.com/office/drawing/2014/chartex" xmlns:cx1="http://schemas.microsoft.com/office/drawing/2015/9/8/chartex" xmlns:cx2="http://schemas.microsoft.com/office/drawing/2015/10/21/chartex" xmlns:cx3="http://schemas.microsoft.com/office/drawing/2016/5/9/chartex" xmlns:cx4="http://schemas.microsoft.com/office/drawing/2016/5/10/chartex" xmlns:cx5="http://schemas.microsoft.com/office/drawing/2016/5/11/chartex" xmlns:cx6="http://schemas.microsoft.com/office/drawing/2016/5/12/chartex" xmlns:cx7="http://schemas.microsoft.com/office/drawing/2016/5/13/chartex" xmlns:cx8="http://schemas.microsoft.com/office/drawing/2016/5/14/chartex" xmlns:mc="http://schemas.openxmlformats.org/markup-compatibility/2006" xmlns:aink="http://schemas.microsoft.com/office/drawing/2016/ink" xmlns:am3d="http://schemas.microsoft.com/office/drawing/2017/model3d" xmlns:o="urn:schemas-microsoft-com:office:office" xmlns:oel="http://schemas.microsoft.com/office/2019/extlst" xmlns:r="http://schemas.openxmlformats.org/officeDocument/2006/relationships" xmlns:m="http://schemas.openxmlformats.org/officeDocument/2006/math" xmlns:v="urn:schemas-microsoft-com:vml" xmlns:wp14="http://schemas.microsoft.com/office/word/2010/wordprocessingDrawing" xmlns:wp="http://schemas.openxmlformats.org/drawingml/2006/wordprocessingDrawing" xmlns:w10="urn:schemas-microsoft-com:office:word" xmlns:w="http://schemas.openxmlformats.org/wordprocessingml/2006/main" xmlns:w14="http://schemas.microsoft.com/office/word/2010/wordml" xmlns:w15="http://schemas.microsoft.com/office/word/2012/wordml" xmlns:w16cex="http://schemas.microsoft.com/office/word/2018/wordml/cex" xmlns:w16cid="http://schemas.microsoft.com/office/word/2016/wordml/cid" xmlns:w16="http://schemas.microsoft.com/office/word/2018/wordml" xmlns:w16du="http://schemas.microsoft.com/office/word/2023/wordml/word16du" xmlns:w16sdtdh="http://schemas.microsoft.com/office/word/2020/wordml/sdtdatahash" xmlns:w16sdtfl="http://schemas.microsoft.com/office/word/2024/wordml/sdtformatlock" xmlns:w16se="http://schemas.microsoft.com/office/word/2015/wordml/symex" xmlns:wpg="http://schemas.microsoft.com/office/word/2010/wordprocessingGroup" xmlns:wpi="http://schemas.microsoft.com/office/word/2010/wordprocessingInk" xmlns:wne="http://schemas.microsoft.com/office/word/2006/wordml" xmlns:wps="http://schemas.microsoft.com/office/word/2010/wordprocessingShape" mc:Ignorable="w14 w15 w16se w16cid w16 w16cex w16sdtdh w16sdtfl w16du wp14">
+  <w:body>
+    <w:tbl>
+      <w:tblPr>
+        <w:tblW w:w="5000" w:type="pct"/>
+        <w:tblBorders>
+          <w:top w:val="none" w:sz="0" w:space="0" w:color="auto"/>
+          <w:left w:val="none" w:sz="0" w:space="0" w:color="auto"/>
+          <w:bottom w:val="none" w:sz="0" w:space="0" w:color="auto"/>
+          <w:right w:val="none" w:sz="0" w:space="0" w:color="auto"/>
+          <w:insideH w:val="none" w:sz="0" w:space="0" w:color="auto"/>
+          <w:insideV w:val="none" w:sz="0" w:space="0" w:color="auto"/>
+        </w:tblBorders>
+        <w:tblLook w:val="0000" w:firstRow="0" w:lastRow="0" w:firstColumn="0" w:lastColumn="0" w:noHBand="0" w:noVBand="0"/>
+      </w:tblPr>
+      <w:tblGrid>
+        <w:gridCol w:w="3203"/>
+        <w:gridCol w:w="6437"/>
+      </w:tblGrid>
+      <w:tr>
+        <w:trPr>
+          <w:trHeight w:val="100" w:hRule="atLeast"/>
+        </w:trPr>
+        <w:tc>
+          <w:tcPr>
+            <w:tcW w:w="1750" w:type="pct"/>
+            <w:shd w:val="clear" w:color="auto" w:fill="2B6CB0"/>
+            <w:tcMar>
+              <w:top w:w="0" w:type="dxa"/>
+              <w:left w:w="200" w:type="dxa"/>
+              <w:right w:w="200" w:type="dxa"/>
+              <w:bottom w:w="0" w:type="dxa"/>
+            </w:tcMar>
+            <w:vAlign w:val="top"/>
+          </w:tcPr>
+          <w:p>
+            <w:pPr>
+              <w:spacing w:before="240" w:after="120"/>
+              <w:jc w:val="center"/>
+            </w:pPr>
+            <w:r>
+              <w:rPr>
+                <w:noProof/>
+              </w:rPr>
+              <w:drawing>
+                <wp:inline distT="0" distB="0" distL="0" distR="0">
+                  <wp:extent cx="1440000" cy="1440000"/>
+                  <wp:effectExtent l="0" t="0" r="0" b="0"/>
+                  <wp:docPr id="201" name="EmployeePhoto"/>
+                  <wp:cNvGraphicFramePr>
+                    <a:graphicFrameLocks xmlns:a="http://schemas.openxmlformats.org/drawingml/2006/main" noChangeAspect="1"/>
+                  </wp:cNvGraphicFramePr>
+                  <a:graphic xmlns:a="http://schemas.openxmlformats.org/drawingml/2006/main">
+                    <a:graphicData uri="http://schemas.openxmlformats.org/drawingml/2006/picture">
+                      <pic:pic xmlns:pic="http://schemas.openxmlformats.org/drawingml/2006/picture">
+                        <pic:nvPicPr>
+                          <pic:cNvPr id="0" name="EmployeePhoto"/>
+                          <pic:cNvPicPr>
+                            <a:picLocks noChangeAspect="1"/>
+                          </pic:cNvPicPr>
+                        </pic:nvPicPr>
+                        <pic:blipFill>
+                          <a:blip r:embed="rId_employee_photo"/>
+                          <a:stretch>
+                            <a:fillRect/>
+                          </a:stretch>
+                        </pic:blipFill>
+                        <pic:spPr>
+                          <a:xfrm>
+                            <a:off x="0" y="0"/>
+                            <a:ext cx="1440000" cy="1440000"/>
+                          </a:xfrm>
+                          <a:prstGeom prst="ellipse">
+                            <a:avLst/>
+                          </a:prstGeom>
+                        </pic:spPr>
+                      </pic:pic>
+                    </a:graphicData>
+                  </a:graphic>
+                </wp:inline>
+              </w:drawing>
+            </w:r>
+          </w:p>
+          <w:p>
+            <w:pPr>
+              <w:spacing w:before="0" w:after="40"/>
+              <w:jc w:val="center"/>
+              <w:rPr>
+                <w:rFonts w:ascii="Calibri" w:hAnsi="Calibri" w:cs="Calibri"/>
+                <w:color w:val="FFFFFF"/>
+                <w:b/>
+                <w:bCs/>
+                <w:sz w:val="36"/>
+                <w:szCs w:val="36"/>
+              </w:rPr>
+            </w:pPr>
+            <w:r>
+              <w:rPr>
+                <w:rFonts w:ascii="Calibri" w:hAnsi="Calibri" w:cs="Calibri"/>
+                <w:color w:val="FFFFFF"/>
+                <w:b/>
+                <w:bCs/>
+                <w:sz w:val="36"/>
+                <w:szCs w:val="36"/>
+              </w:rPr>
+              <w:t xml:space="preserve">{firstName} {lastName}</w:t>
+            </w:r>
+          </w:p>
+          <w:p>
+            <w:pPr>
+              <w:spacing w:before="0" w:after="160"/>
+              <w:jc w:val="center"/>
+              <w:rPr>
+                <w:rFonts w:ascii="Calibri" w:hAnsi="Calibri" w:cs="Calibri"/>
+                <w:color w:val="FFFFFF"/>
+                <w:sz w:val="18"/>
+                <w:szCs w:val="18"/>
+              </w:rPr>
+            </w:pPr>
+            <w:r>
+              <w:rPr>
+                <w:rFonts w:ascii="Calibri" w:hAnsi="Calibri" w:cs="Calibri"/>
+                <w:color w:val="FFFFFF"/>
+                <w:sz w:val="18"/>
+                <w:szCs w:val="18"/>
+              </w:rPr>
+              <w:t xml:space="preserve">{department}</w:t>
+            </w:r>
+          </w:p>
+          <w:p>
+            <w:pPr>
+              <w:pBdr>
+                <w:bottom w:val="single" w:sz="4" w:space="1" w:color="FFFFFF"/>
+              </w:pBdr>
+              <w:spacing w:before="200" w:after="80"/>
+              <w:rPr>
+                <w:rFonts w:ascii="Calibri" w:hAnsi="Calibri" w:cs="Calibri"/>
+                <w:color w:val="FFFFFF"/>
+                <w:b/>
+                <w:bCs/>
+                <w:sz w:val="20"/>
+                <w:szCs w:val="20"/>
+              </w:rPr>
+            </w:pPr>
+            <w:r>
+              <w:rPr>
+                <w:rFonts w:ascii="Calibri" w:hAnsi="Calibri" w:cs="Calibri"/>
+                <w:color w:val="FFFFFF"/>
+                <w:b/>
+                <w:bCs/>
+                <w:sz w:val="20"/>
+                <w:szCs w:val="20"/>
+              </w:rPr>
+              <w:t xml:space="preserve">ΕΠΙΚΟΙΝΩΝΙΑ</w:t>
+            </w:r>
+          </w:p>
+          <w:p>
+            <w:pPr>
+              <w:spacing w:before="0" w:after="60"/>
+              <w:rPr>
+                <w:rFonts w:ascii="Calibri" w:hAnsi="Calibri" w:cs="Calibri"/>
+                <w:color w:val="FFFFFF"/>
+                <w:sz w:val="17"/>
+                <w:szCs w:val="17"/>
+              </w:rPr>
+            </w:pPr>
+            <w:r>
+              <w:rPr>
+                <w:rFonts w:ascii="Calibri" w:hAnsi="Calibri" w:cs="Calibri"/>
+                <w:color w:val="FFFFFF"/>
+                <w:sz w:val="17"/>
+                <w:szCs w:val="17"/>
+              </w:rPr>
+              <w:t xml:space="preserve">Τηλ: {phone}</w:t>
+            </w:r>
+          </w:p>
+          <w:p>
+            <w:pPr>
+              <w:spacing w:before="0" w:after="60"/>
+              <w:rPr>
+                <w:rFonts w:ascii="Calibri" w:hAnsi="Calibri" w:cs="Calibri"/>
+                <w:color w:val="FFFFFF"/>
+                <w:sz w:val="17"/>
+                <w:szCs w:val="17"/>
+              </w:rPr>
+            </w:pPr>
+            <w:r>
+              <w:rPr>
+                <w:rFonts w:ascii="Calibri" w:hAnsi="Calibri" w:cs="Calibri"/>
+                <w:color w:val="FFFFFF"/>
+                <w:sz w:val="17"/>
+                <w:szCs w:val="17"/>
+              </w:rPr>
+              <w:t xml:space="preserve">Email: {email}</w:t>
+            </w:r>
+          </w:p>
+          <w:p>
+            <w:pPr>
+              <w:spacing w:before="0" w:after="60"/>
+              <w:rPr>
+                <w:rFonts w:ascii="Calibri" w:hAnsi="Calibri" w:cs="Calibri"/>
+                <w:color w:val="FFFFFF"/>
+                <w:sz w:val="17"/>
+                <w:szCs w:val="17"/>
+              </w:rPr>
+            </w:pPr>
+            <w:r>
+              <w:rPr>
+                <w:rFonts w:ascii="Calibri" w:hAnsi="Calibri" w:cs="Calibri"/>
+                <w:color w:val="FFFFFF"/>
+                <w:sz w:val="17"/>
+                <w:szCs w:val="17"/>
+              </w:rPr>
+              <w:t xml:space="preserve">{homeAddress}</w:t>
+            </w:r>
+          </w:p>
+          <w:p>
+            <w:pPr>
+              <w:spacing w:before="0" w:after="60"/>
+              <w:rPr>
+                <w:rFonts w:ascii="Calibri" w:hAnsi="Calibri" w:cs="Calibri"/>
+                <w:color w:val="FFFFFF"/>
+                <w:sz w:val="17"/>
+                <w:szCs w:val="17"/>
+              </w:rPr>
+            </w:pPr>
+            <w:r>
+              <w:rPr>
+                <w:rFonts w:ascii="Calibri" w:hAnsi="Calibri" w:cs="Calibri"/>
+                <w:color w:val="FFFFFF"/>
+                <w:sz w:val="17"/>
+                <w:szCs w:val="17"/>
+              </w:rPr>
+              <w:t xml:space="preserve">Ημ/νία: {dateOfBirth}</w:t>
+            </w:r>
+          </w:p>
+          <w:p>
+            <w:pPr>
+              <w:spacing w:before="0" w:after="60"/>
+              <w:rPr>
+                <w:rFonts w:ascii="Calibri" w:hAnsi="Calibri" w:cs="Calibri"/>
+                <w:color w:val="FFFFFF"/>
+                <w:sz w:val="17"/>
+                <w:szCs w:val="17"/>
+              </w:rPr>
+            </w:pPr>
+            <w:r>
+              <w:rPr>
+                <w:rFonts w:ascii="Calibri" w:hAnsi="Calibri" w:cs="Calibri"/>
+                <w:color w:val="FFFFFF"/>
+                <w:sz w:val="17"/>
+                <w:szCs w:val="17"/>
+              </w:rPr>
+              <w:t xml:space="preserve">Τόπος: {placeOfBirth}</w:t>
+            </w:r>
+          </w:p>
+          <w:p>
+            <w:pPr>
+              <w:spacing w:before="0" w:after="80"/>
+              <w:rPr>
+                <w:rFonts w:ascii="Calibri" w:hAnsi="Calibri" w:cs="Calibri"/>
+                <w:color w:val="FFFFFF"/>
+                <w:sz w:val="17"/>
+                <w:szCs w:val="17"/>
+              </w:rPr>
+            </w:pPr>
+          </w:p>
+          <w:p>
+            <w:pPr>
+              <w:pBdr>
+                <w:bottom w:val="single" w:sz="4" w:space="1" w:color="FFFFFF"/>
+              </w:pBdr>
+              <w:spacing w:before="200" w:after="80"/>
+              <w:rPr>
+                <w:rFonts w:ascii="Calibri" w:hAnsi="Calibri" w:cs="Calibri"/>
+                <w:color w:val="FFFFFF"/>
+                <w:b/>
+                <w:bCs/>
+                <w:sz w:val="20"/>
+                <w:szCs w:val="20"/>
+              </w:rPr>
+            </w:pPr>
+            <w:r>
+              <w:rPr>
+                <w:rFonts w:ascii="Calibri" w:hAnsi="Calibri" w:cs="Calibri"/>
+                <w:color w:val="FFFFFF"/>
+                <w:b/>
+                <w:bCs/>
+                <w:sz w:val="20"/>
+                <w:szCs w:val="20"/>
+              </w:rPr>
+              <w:t xml:space="preserve">ΣΧΕΤΙΚΑ ΜΕ ΕΜΕΝΑ</w:t>
+            </w:r>
+          </w:p>
+          <w:p>
+            <w:pPr>
+              <w:spacing w:before="0" w:after="80"/>
+              <w:rPr>
+                <w:rFonts w:ascii="Calibri" w:hAnsi="Calibri" w:cs="Calibri"/>
+                <w:color w:val="FFFFFF"/>
+                <w:sz w:val="17"/>
+                <w:szCs w:val="17"/>
+              </w:rPr>
+            </w:pPr>
+          </w:p>
+          <w:p>
+            <w:pPr>
+              <w:spacing w:before="0" w:after="80"/>
+              <w:rPr>
+                <w:rFonts w:ascii="Calibri" w:hAnsi="Calibri" w:cs="Calibri"/>
+                <w:color w:val="FFFFFF"/>
+                <w:sz w:val="17"/>
+                <w:szCs w:val="17"/>
+              </w:rPr>
+            </w:pPr>
+          </w:p>
+          <w:p>
+            <w:pPr>
+              <w:spacing w:before="0" w:after="80"/>
+              <w:rPr>
+                <w:rFonts w:ascii="Calibri" w:hAnsi="Calibri" w:cs="Calibri"/>
+                <w:color w:val="FFFFFF"/>
+                <w:sz w:val="17"/>
+                <w:szCs w:val="17"/>
+              </w:rPr>
+            </w:pPr>
+          </w:p>
+          <w:p>
+            <w:pPr>
+              <w:spacing w:before="0" w:after="80"/>
+              <w:rPr>
+                <w:rFonts w:ascii="Calibri" w:hAnsi="Calibri" w:cs="Calibri"/>
+                <w:color w:val="FFFFFF"/>
+                <w:sz w:val="17"/>
+                <w:szCs w:val="17"/>
+              </w:rPr>
+            </w:pPr>
+          </w:p>
+          <w:p>
+            <w:pPr>
+              <w:pBdr>
+                <w:bottom w:val="single" w:sz="4" w:space="1" w:color="FFFFFF"/>
+              </w:pBdr>
+              <w:spacing w:before="200" w:after="80"/>
+              <w:rPr>
+                <w:rFonts w:ascii="Calibri" w:hAnsi="Calibri" w:cs="Calibri"/>
+                <w:color w:val="FFFFFF"/>
+                <w:b/>
+                <w:bCs/>
+                <w:sz w:val="20"/>
+                <w:szCs w:val="20"/>
+              </w:rPr>
+            </w:pPr>
+            <w:r>
+              <w:rPr>
+                <w:rFonts w:ascii="Calibri" w:hAnsi="Calibri" w:cs="Calibri"/>
+                <w:color w:val="FFFFFF"/>
+                <w:b/>
+                <w:bCs/>
+                <w:sz w:val="20"/>
+                <w:szCs w:val="20"/>
+              </w:rPr>
+              <w:t xml:space="preserve">ΓΝΩΣΕΙΣ</w:t>
+            </w:r>
+          </w:p>
+          <w:p>
+            <w:pPr>
+              <w:spacing w:before="0" w:after="0"/>
+            </w:pPr>
+            <w:r>
+              <w:t>{#skillRows}</w:t>
+            </w:r>
+          </w:p>
+          <w:p>
+            <w:pPr>
+              <w:spacing w:before="0" w:after="60"/>
+              <w:rPr>
+                <w:rFonts w:ascii="Calibri" w:hAnsi="Calibri" w:cs="Calibri"/>
+                <w:color w:val="FFFFFF"/>
+                <w:sz w:val="17"/>
+                <w:szCs w:val="17"/>
+              </w:rPr>
+            </w:pPr>
+            <w:r>
+              <w:rPr>
+                <w:rFonts w:ascii="Calibri" w:hAnsi="Calibri" w:cs="Calibri"/>
+                <w:color w:val="FFFFFF"/>
+                <w:sz w:val="17"/>
+                <w:szCs w:val="17"/>
+              </w:rPr>
+              <w:t xml:space="preserve">• {skillText}</w:t>
+            </w:r>
+          </w:p>
+          <w:p>
+            <w:pPr>
+              <w:spacing w:before="0" w:after="0"/>
+            </w:pPr>
+            <w:r>
+              <w:t>{/skillRows}</w:t>
+            </w:r>
+          </w:p>
+        </w:tc>
+        <w:tc>
+          <w:tcPr>
+            <w:tcW w:w="3250" w:type="pct"/>
+            <w:shd w:val="clear" w:color="auto" w:fill="FFFFFF"/>
+            <w:tcMar>
+              <w:top w:w="200" w:type="dxa"/>
+              <w:left w:w="300" w:type="dxa"/>
+              <w:right w:w="200" w:type="dxa"/>
+              <w:bottom w:w="0" w:type="dxa"/>
+            </w:tcMar>
+            <w:vAlign w:val="top"/>
+          </w:tcPr>
+          <w:p>
+            <w:pPr>
+              <w:pBdr>
+                <w:bottom w:val="single" w:sz="6" w:space="1" w:color="2B6CB0"/>
+              </w:pBdr>
+              <w:spacing w:before="280" w:after="80"/>
+              <w:rPr>
+                <w:rFonts w:ascii="Calibri" w:hAnsi="Calibri" w:cs="Calibri"/>
+                <w:color w:val="2B6CB0"/>
+                <w:b/>
+                <w:bCs/>
+                <w:sz w:val="24"/>
+                <w:szCs w:val="24"/>
+              </w:rPr>
+            </w:pPr>
+            <w:r>
+              <w:rPr>
+                <w:rFonts w:ascii="Calibri" w:hAnsi="Calibri" w:cs="Calibri"/>
+                <w:color w:val="2B6CB0"/>
+                <w:b/>
+                <w:bCs/>
+                <w:sz w:val="24"/>
+                <w:szCs w:val="24"/>
+              </w:rPr>
+              <w:t xml:space="preserve">ΕΚΠΑΙΔΕΥΣΗ</w:t>
+            </w:r>
+          </w:p>
+          <w:p>
+            <w:pPr>
+              <w:spacing w:before="0" w:after="0"/>
+            </w:pPr>
+            <w:r>
+              <w:t>{#educationOnlyRows}</w:t>
+            </w:r>
+          </w:p>
+          <w:p>
+            <w:pPr>
+              <w:spacing w:before="100" w:after="0"/>
+              <w:rPr>
+                <w:rFonts w:ascii="Calibri" w:hAnsi="Calibri" w:cs="Calibri"/>
+                <w:color w:val="1A202C"/>
+                <w:b/>
+                <w:bCs/>
+                <w:sz w:val="20"/>
+                <w:szCs w:val="20"/>
+              </w:rPr>
+            </w:pPr>
+            <w:r>
+              <w:rPr>
+                <w:rFonts w:ascii="Calibri" w:hAnsi="Calibri" w:cs="Calibri"/>
+                <w:color w:val="1A202C"/>
+                <w:b/>
+                <w:bCs/>
+                <w:sz w:val="20"/>
+                <w:szCs w:val="20"/>
+              </w:rPr>
+              <w:t xml:space="preserve">{institutionFull}</w:t>
+            </w:r>
+          </w:p>
+          <w:p>
+            <w:pPr>
+              <w:spacing w:before="0" w:after="0"/>
+              <w:rPr>
+                <w:rFonts w:ascii="Calibri" w:hAnsi="Calibri" w:cs="Calibri"/>
+                <w:color w:val="2B6CB0"/>
+                <w:i/>
+                <w:iCs/>
+                <w:sz w:val="18"/>
+                <w:szCs w:val="18"/>
+              </w:rPr>
+            </w:pPr>
+            <w:r>
+              <w:rPr>
+                <w:rFonts w:ascii="Calibri" w:hAnsi="Calibri" w:cs="Calibri"/>
+                <w:color w:val="2B6CB0"/>
+                <w:i/>
+                <w:iCs/>
+                <w:sz w:val="18"/>
+                <w:szCs w:val="18"/>
+              </w:rPr>
+              <w:t xml:space="preserve">{degreeTitle}</w:t>
+            </w:r>
+          </w:p>
+          <w:p>
+            <w:pPr>
+              <w:spacing w:before="0" w:after="0"/>
+              <w:rPr>
+                <w:rFonts w:ascii="Calibri" w:hAnsi="Calibri" w:cs="Calibri"/>
+                <w:color w:val="718096"/>
+                <w:sz w:val="18"/>
+                <w:szCs w:val="18"/>
+              </w:rPr>
+            </w:pPr>
+            <w:r>
+              <w:rPr>
+                <w:rFonts w:ascii="Calibri" w:hAnsi="Calibri" w:cs="Calibri"/>
+                <w:color w:val="718096"/>
+                <w:sz w:val="18"/>
+                <w:szCs w:val="18"/>
+              </w:rPr>
+              <w:t xml:space="preserve">{degreeType}</w:t>
+            </w:r>
+          </w:p>
+          <w:p>
+            <w:pPr>
+              <w:spacing w:before="0" w:after="0"/>
+              <w:rPr>
+                <w:rFonts w:ascii="Calibri" w:hAnsi="Calibri" w:cs="Calibri"/>
+                <w:color w:val="718096"/>
+                <w:sz w:val="18"/>
+                <w:szCs w:val="18"/>
+              </w:rPr>
+            </w:pPr>
+            <w:r>
+              <w:rPr>
+                <w:rFonts w:ascii="Calibri" w:hAnsi="Calibri" w:cs="Calibri"/>
+                <w:color w:val="718096"/>
+                <w:sz w:val="18"/>
+                <w:szCs w:val="18"/>
+              </w:rPr>
+              <w:t xml:space="preserve">{specialization}</w:t>
+            </w:r>
+          </w:p>
+          <w:p>
+            <w:pPr>
+              <w:spacing w:before="0" w:after="0"/>
+              <w:rPr>
+                <w:rFonts w:ascii="Calibri" w:hAnsi="Calibri" w:cs="Calibri"/>
+                <w:color w:val="718096"/>
+                <w:sz w:val="18"/>
+                <w:szCs w:val="18"/>
+              </w:rPr>
+            </w:pPr>
+            <w:r>
+              <w:rPr>
+                <w:rFonts w:ascii="Calibri" w:hAnsi="Calibri" w:cs="Calibri"/>
+                <w:color w:val="718096"/>
+                <w:sz w:val="18"/>
+                <w:szCs w:val="18"/>
+              </w:rPr>
+              <w:t xml:space="preserve">{dateAwarded}</w:t>
+            </w:r>
+          </w:p>
+          <w:p>
+            <w:pPr>
+              <w:spacing w:before="0" w:after="80"/>
+            </w:pPr>
+          </w:p>
+          <w:p>
+            <w:pPr>
+              <w:spacing w:before="0" w:after="0"/>
+            </w:pPr>
+            <w:r>
+              <w:t>{/educationOnlyRows}</w:t>
+            </w:r>
+          </w:p>
+          <w:p>
+            <w:pPr>
+              <w:pBdr>
+                <w:bottom w:val="single" w:sz="6" w:space="1" w:color="2B6CB0"/>
+              </w:pBdr>
+              <w:spacing w:before="280" w:after="80"/>
+              <w:rPr>
+                <w:rFonts w:ascii="Calibri" w:hAnsi="Calibri" w:cs="Calibri"/>
+                <w:color w:val="2B6CB0"/>
+                <w:b/>
+                <w:bCs/>
+                <w:sz w:val="24"/>
+                <w:szCs w:val="24"/>
+              </w:rPr>
+            </w:pPr>
+            <w:r>
+              <w:rPr>
+                <w:rFonts w:ascii="Calibri" w:hAnsi="Calibri" w:cs="Calibri"/>
+                <w:color w:val="2B6CB0"/>
+                <w:b/>
+                <w:bCs/>
+                <w:sz w:val="24"/>
+                <w:szCs w:val="24"/>
+              </w:rPr>
+              <w:t xml:space="preserve">ΕΠΑΓΓΕΛΜΑΤΙΚΗ ΕΜΠΕΙΡΙΑ</w:t>
+            </w:r>
+          </w:p>
+          <w:p>
+            <w:pPr>
+              <w:spacing w:before="0" w:after="0"/>
+            </w:pPr>
+            <w:r>
+              <w:t>{#workExperienceRows}</w:t>
+            </w:r>
+          </w:p>
+          <w:p>
+            <w:pPr>
+              <w:spacing w:before="100" w:after="0"/>
+              <w:rPr>
+                <w:rFonts w:ascii="Calibri" w:hAnsi="Calibri" w:cs="Calibri"/>
+                <w:color w:val="1A202C"/>
+                <w:b/>
+                <w:bCs/>
+                <w:sz w:val="20"/>
+                <w:szCs w:val="20"/>
+              </w:rPr>
+            </w:pPr>
+            <w:r>
+              <w:rPr>
+                <w:rFonts w:ascii="Calibri" w:hAnsi="Calibri" w:cs="Calibri"/>
+                <w:color w:val="1A202C"/>
+                <w:b/>
+                <w:bCs/>
+                <w:sz w:val="20"/>
+                <w:szCs w:val="20"/>
+              </w:rPr>
+              <w:t xml:space="preserve">{employerName}</w:t>
+            </w:r>
+          </w:p>
+          <w:p>
+            <w:pPr>
+              <w:spacing w:before="0" w:after="0"/>
+              <w:rPr>
+                <w:rFonts w:ascii="Calibri" w:hAnsi="Calibri" w:cs="Calibri"/>
+                <w:color w:val="2B6CB0"/>
+                <w:i/>
+                <w:iCs/>
+                <w:sz w:val="18"/>
+                <w:szCs w:val="18"/>
+              </w:rPr>
+            </w:pPr>
+            <w:r>
+              <w:rPr>
+                <w:rFonts w:ascii="Calibri" w:hAnsi="Calibri" w:cs="Calibri"/>
+                <w:color w:val="2B6CB0"/>
+                <w:i/>
+                <w:iCs/>
+                <w:sz w:val="18"/>
+                <w:szCs w:val="18"/>
+              </w:rPr>
+              <w:t xml:space="preserve">{projectText}</w:t>
+            </w:r>
+          </w:p>
+          <w:p>
+            <w:pPr>
+              <w:spacing w:before="0" w:after="0"/>
+              <w:rPr>
+                <w:rFonts w:ascii="Calibri" w:hAnsi="Calibri" w:cs="Calibri"/>
+                <w:color w:val="718096"/>
+                <w:sz w:val="18"/>
+                <w:szCs w:val="18"/>
+              </w:rPr>
+            </w:pPr>
+            <w:r>
+              <w:rPr>
+                <w:rFonts w:ascii="Calibri" w:hAnsi="Calibri" w:cs="Calibri"/>
+                <w:color w:val="718096"/>
+                <w:sz w:val="18"/>
+                <w:szCs w:val="18"/>
+              </w:rPr>
+              <w:t xml:space="preserve">{roleName}</w:t>
+            </w:r>
+          </w:p>
+          <w:p>
+            <w:pPr>
+              <w:spacing w:before="0" w:after="0"/>
+              <w:rPr>
+                <w:rFonts w:ascii="Calibri" w:hAnsi="Calibri" w:cs="Calibri"/>
+                <w:color w:val="718096"/>
+                <w:sz w:val="18"/>
+                <w:szCs w:val="18"/>
+              </w:rPr>
+            </w:pPr>
+            <w:r>
+              <w:rPr>
+                <w:rFonts w:ascii="Calibri" w:hAnsi="Calibri" w:cs="Calibri"/>
+                <w:color w:val="718096"/>
+                <w:sz w:val="18"/>
+                <w:szCs w:val="18"/>
+              </w:rPr>
+              <w:t xml:space="preserve">{period}</w:t>
+            </w:r>
+          </w:p>
+          <w:p>
+            <w:pPr>
+              <w:spacing w:before="0" w:after="80"/>
+            </w:pPr>
+          </w:p>
+          <w:p>
+            <w:pPr>
+              <w:spacing w:before="0" w:after="0"/>
+            </w:pPr>
+            <w:r>
+              <w:t>{/workExperienceRows}</w:t>
+            </w:r>
+          </w:p>
+          <w:p>
+            <w:pPr>
+              <w:spacing w:before="0" w:after="0"/>
+            </w:pPr>
+            <w:r>
+              <w:t>{#hasPublications}</w:t>
+            </w:r>
+          </w:p>
+          <w:p>
+            <w:pPr>
+              <w:pBdr>
+                <w:bottom w:val="single" w:sz="6" w:space="1" w:color="2B6CB0"/>
+              </w:pBdr>
+              <w:spacing w:before="280" w:after="80"/>
+              <w:rPr>
+                <w:rFonts w:ascii="Calibri" w:hAnsi="Calibri" w:cs="Calibri"/>
+                <w:color w:val="2B6CB0"/>
+                <w:b/>
+                <w:bCs/>
+                <w:sz w:val="24"/>
+                <w:szCs w:val="24"/>
+              </w:rPr>
+            </w:pPr>
+            <w:r>
+              <w:rPr>
+                <w:rFonts w:ascii="Calibri" w:hAnsi="Calibri" w:cs="Calibri"/>
+                <w:color w:val="2B6CB0"/>
+                <w:b/>
+                <w:bCs/>
+                <w:sz w:val="24"/>
+                <w:szCs w:val="24"/>
+              </w:rPr>
+              <w:t xml:space="preserve">ΔΗΜΟΣΙΕΥΣΕΙΣ</w:t>
+            </w:r>
+          </w:p>
+          <w:p>
+            <w:pPr>
+              <w:spacing w:before="0" w:after="0"/>
+              <w:rPr>
+                <w:rFonts w:ascii="Calibri" w:hAnsi="Calibri" w:cs="Calibri"/>
+                <w:color w:val="718096"/>
+                <w:sz w:val="18"/>
+                <w:szCs w:val="18"/>
+              </w:rPr>
+            </w:pPr>
+            <w:r>
+              <w:rPr>
+                <w:rFonts w:ascii="Calibri" w:hAnsi="Calibri" w:cs="Calibri"/>
+                <w:color w:val="718096"/>
+                <w:sz w:val="18"/>
+                <w:szCs w:val="18"/>
+              </w:rPr>
+              <w:t xml:space="preserve">{publicationsText}</w:t>
+            </w:r>
+          </w:p>
+          <w:p>
+            <w:pPr>
+              <w:spacing w:before="0" w:after="0"/>
+            </w:pPr>
+            <w:r>
+              <w:t>{/hasPublications}</w:t>
+            </w:r>
+          </w:p>
+          <w:p>
+            <w:pPr>
+              <w:spacing w:before="0" w:after="80"/>
+            </w:pPr>
+          </w:p>
+        </w:tc>
+      </w:tr>
+    </w:tbl>
+    <w:sectPr>
+      <w:pgSz w:w="11906" w:h="16838"/>
+      <w:pgMar w:top="567" w:right="567" w:bottom="567" w:left="567" w:header="708" w:footer="708" w:gutter="0"/>
+    </w:sectPr>
+  </w:body>
+</w:document>
 </file>
 
 <file path=word/endnotes.xml><?xml version="1.0" encoding="utf-8"?>

</xml_diff>

<commit_message>
CV sidebar template: lighter blue palette, larger photo, suppress empty experience lines
- Sidebar fill changed from dark #2B6CB0 to light-medium #7AB2D3 (matches Canva reference)
- All sidebar text changed to dark (#1B3A52 headers, #1A202C body) — readable on light bg
- Sidebar section header underline changed from white to medium blue #4A86C8
- Photo size increased from 1440000 to 1800000 EMU (~4.9 cm diameter)
- Right-column section headers and italics use #2B6CB0; normal text uses #4A5568
- {#projectText}...{/projectText} and {#roleName}...{/roleName} conditional blocks
  suppress blank italic/normal lines when fields are empty (CMT availability entries)
- {#degreeType}/{#specialization} conditionals suppress empty education detail lines
- cvService: department field suppresses "N/A" value (shows empty instead)

Co-Authored-By: Claude Sonnet 4.6 <noreply@anthropic.com>
</commit_message>
<xml_diff>
--- a/backend/templates/cv_sidebar_blue_placeholders.docx
+++ b/backend/templates/cv_sidebar_blue_placeholders.docx
@@ -26,7 +26,7 @@
         <w:tc>
           <w:tcPr>
             <w:tcW w:w="1750" w:type="pct"/>
-            <w:shd w:val="clear" w:color="auto" w:fill="2B6CB0"/>
+            <w:shd w:val="clear" w:color="auto" w:fill="7AB2D3"/>
             <w:tcMar>
               <w:top w:w="0" w:type="dxa"/>
               <w:left w:w="200" w:type="dxa"/>
@@ -46,7 +46,7 @@
               </w:rPr>
               <w:drawing>
                 <wp:inline distT="0" distB="0" distL="0" distR="0">
-                  <wp:extent cx="1440000" cy="1440000"/>
+                  <wp:extent cx="1800000" cy="1800000"/>
                   <wp:effectExtent l="0" t="0" r="0" b="0"/>
                   <wp:docPr id="201" name="EmployeePhoto"/>
                   <wp:cNvGraphicFramePr>
@@ -70,7 +70,7 @@
                         <pic:spPr>
                           <a:xfrm>
                             <a:off x="0" y="0"/>
-                            <a:ext cx="1440000" cy="1440000"/>
+                            <a:ext cx="1800000" cy="1800000"/>
                           </a:xfrm>
                           <a:prstGeom prst="ellipse">
                             <a:avLst/>
@@ -89,7 +89,7 @@
               <w:jc w:val="center"/>
               <w:rPr>
                 <w:rFonts w:ascii="Calibri" w:hAnsi="Calibri" w:cs="Calibri"/>
-                <w:color w:val="FFFFFF"/>
+                <w:color w:val="1B3A52"/>
                 <w:b/>
                 <w:bCs/>
                 <w:sz w:val="36"/>
@@ -99,7 +99,7 @@
             <w:r>
               <w:rPr>
                 <w:rFonts w:ascii="Calibri" w:hAnsi="Calibri" w:cs="Calibri"/>
-                <w:color w:val="FFFFFF"/>
+                <w:color w:val="1B3A52"/>
                 <w:b/>
                 <w:bCs/>
                 <w:sz w:val="36"/>
@@ -114,7 +114,7 @@
               <w:jc w:val="center"/>
               <w:rPr>
                 <w:rFonts w:ascii="Calibri" w:hAnsi="Calibri" w:cs="Calibri"/>
-                <w:color w:val="FFFFFF"/>
+                <w:color w:val="1A202C"/>
                 <w:sz w:val="18"/>
                 <w:szCs w:val="18"/>
               </w:rPr>
@@ -122,7 +122,7 @@
             <w:r>
               <w:rPr>
                 <w:rFonts w:ascii="Calibri" w:hAnsi="Calibri" w:cs="Calibri"/>
-                <w:color w:val="FFFFFF"/>
+                <w:color w:val="1A202C"/>
                 <w:sz w:val="18"/>
                 <w:szCs w:val="18"/>
               </w:rPr>
@@ -132,12 +132,12 @@
           <w:p>
             <w:pPr>
               <w:pBdr>
-                <w:bottom w:val="single" w:sz="4" w:space="1" w:color="FFFFFF"/>
+                <w:bottom w:val="single" w:sz="4" w:space="1" w:color="4A86C8"/>
               </w:pBdr>
               <w:spacing w:before="200" w:after="80"/>
               <w:rPr>
                 <w:rFonts w:ascii="Calibri" w:hAnsi="Calibri" w:cs="Calibri"/>
-                <w:color w:val="FFFFFF"/>
+                <w:color w:val="1B3A52"/>
                 <w:b/>
                 <w:bCs/>
                 <w:sz w:val="20"/>
@@ -147,7 +147,7 @@
             <w:r>
               <w:rPr>
                 <w:rFonts w:ascii="Calibri" w:hAnsi="Calibri" w:cs="Calibri"/>
-                <w:color w:val="FFFFFF"/>
+                <w:color w:val="1B3A52"/>
                 <w:b/>
                 <w:bCs/>
                 <w:sz w:val="20"/>
@@ -161,7 +161,7 @@
               <w:spacing w:before="0" w:after="60"/>
               <w:rPr>
                 <w:rFonts w:ascii="Calibri" w:hAnsi="Calibri" w:cs="Calibri"/>
-                <w:color w:val="FFFFFF"/>
+                <w:color w:val="1A202C"/>
                 <w:sz w:val="17"/>
                 <w:szCs w:val="17"/>
               </w:rPr>
@@ -169,7 +169,7 @@
             <w:r>
               <w:rPr>
                 <w:rFonts w:ascii="Calibri" w:hAnsi="Calibri" w:cs="Calibri"/>
-                <w:color w:val="FFFFFF"/>
+                <w:color w:val="1A202C"/>
                 <w:sz w:val="17"/>
                 <w:szCs w:val="17"/>
               </w:rPr>
@@ -181,7 +181,7 @@
               <w:spacing w:before="0" w:after="60"/>
               <w:rPr>
                 <w:rFonts w:ascii="Calibri" w:hAnsi="Calibri" w:cs="Calibri"/>
-                <w:color w:val="FFFFFF"/>
+                <w:color w:val="1A202C"/>
                 <w:sz w:val="17"/>
                 <w:szCs w:val="17"/>
               </w:rPr>
@@ -189,7 +189,7 @@
             <w:r>
               <w:rPr>
                 <w:rFonts w:ascii="Calibri" w:hAnsi="Calibri" w:cs="Calibri"/>
-                <w:color w:val="FFFFFF"/>
+                <w:color w:val="1A202C"/>
                 <w:sz w:val="17"/>
                 <w:szCs w:val="17"/>
               </w:rPr>
@@ -201,7 +201,7 @@
               <w:spacing w:before="0" w:after="60"/>
               <w:rPr>
                 <w:rFonts w:ascii="Calibri" w:hAnsi="Calibri" w:cs="Calibri"/>
-                <w:color w:val="FFFFFF"/>
+                <w:color w:val="1A202C"/>
                 <w:sz w:val="17"/>
                 <w:szCs w:val="17"/>
               </w:rPr>
@@ -209,7 +209,7 @@
             <w:r>
               <w:rPr>
                 <w:rFonts w:ascii="Calibri" w:hAnsi="Calibri" w:cs="Calibri"/>
-                <w:color w:val="FFFFFF"/>
+                <w:color w:val="1A202C"/>
                 <w:sz w:val="17"/>
                 <w:szCs w:val="17"/>
               </w:rPr>
@@ -221,7 +221,7 @@
               <w:spacing w:before="0" w:after="60"/>
               <w:rPr>
                 <w:rFonts w:ascii="Calibri" w:hAnsi="Calibri" w:cs="Calibri"/>
-                <w:color w:val="FFFFFF"/>
+                <w:color w:val="1A202C"/>
                 <w:sz w:val="17"/>
                 <w:szCs w:val="17"/>
               </w:rPr>
@@ -229,7 +229,7 @@
             <w:r>
               <w:rPr>
                 <w:rFonts w:ascii="Calibri" w:hAnsi="Calibri" w:cs="Calibri"/>
-                <w:color w:val="FFFFFF"/>
+                <w:color w:val="1A202C"/>
                 <w:sz w:val="17"/>
                 <w:szCs w:val="17"/>
               </w:rPr>
@@ -241,7 +241,7 @@
               <w:spacing w:before="0" w:after="60"/>
               <w:rPr>
                 <w:rFonts w:ascii="Calibri" w:hAnsi="Calibri" w:cs="Calibri"/>
-                <w:color w:val="FFFFFF"/>
+                <w:color w:val="1A202C"/>
                 <w:sz w:val="17"/>
                 <w:szCs w:val="17"/>
               </w:rPr>
@@ -249,7 +249,7 @@
             <w:r>
               <w:rPr>
                 <w:rFonts w:ascii="Calibri" w:hAnsi="Calibri" w:cs="Calibri"/>
-                <w:color w:val="FFFFFF"/>
+                <w:color w:val="1A202C"/>
                 <w:sz w:val="17"/>
                 <w:szCs w:val="17"/>
               </w:rPr>
@@ -261,7 +261,7 @@
               <w:spacing w:before="0" w:after="80"/>
               <w:rPr>
                 <w:rFonts w:ascii="Calibri" w:hAnsi="Calibri" w:cs="Calibri"/>
-                <w:color w:val="FFFFFF"/>
+                <w:color w:val="1A202C"/>
                 <w:sz w:val="17"/>
                 <w:szCs w:val="17"/>
               </w:rPr>
@@ -270,12 +270,12 @@
           <w:p>
             <w:pPr>
               <w:pBdr>
-                <w:bottom w:val="single" w:sz="4" w:space="1" w:color="FFFFFF"/>
+                <w:bottom w:val="single" w:sz="4" w:space="1" w:color="4A86C8"/>
               </w:pBdr>
               <w:spacing w:before="200" w:after="80"/>
               <w:rPr>
                 <w:rFonts w:ascii="Calibri" w:hAnsi="Calibri" w:cs="Calibri"/>
-                <w:color w:val="FFFFFF"/>
+                <w:color w:val="1B3A52"/>
                 <w:b/>
                 <w:bCs/>
                 <w:sz w:val="20"/>
@@ -285,7 +285,7 @@
             <w:r>
               <w:rPr>
                 <w:rFonts w:ascii="Calibri" w:hAnsi="Calibri" w:cs="Calibri"/>
-                <w:color w:val="FFFFFF"/>
+                <w:color w:val="1B3A52"/>
                 <w:b/>
                 <w:bCs/>
                 <w:sz w:val="20"/>
@@ -299,7 +299,7 @@
               <w:spacing w:before="0" w:after="80"/>
               <w:rPr>
                 <w:rFonts w:ascii="Calibri" w:hAnsi="Calibri" w:cs="Calibri"/>
-                <w:color w:val="FFFFFF"/>
+                <w:color w:val="1A202C"/>
                 <w:sz w:val="17"/>
                 <w:szCs w:val="17"/>
               </w:rPr>
@@ -310,7 +310,7 @@
               <w:spacing w:before="0" w:after="80"/>
               <w:rPr>
                 <w:rFonts w:ascii="Calibri" w:hAnsi="Calibri" w:cs="Calibri"/>
-                <w:color w:val="FFFFFF"/>
+                <w:color w:val="1A202C"/>
                 <w:sz w:val="17"/>
                 <w:szCs w:val="17"/>
               </w:rPr>
@@ -321,7 +321,7 @@
               <w:spacing w:before="0" w:after="80"/>
               <w:rPr>
                 <w:rFonts w:ascii="Calibri" w:hAnsi="Calibri" w:cs="Calibri"/>
-                <w:color w:val="FFFFFF"/>
+                <w:color w:val="1A202C"/>
                 <w:sz w:val="17"/>
                 <w:szCs w:val="17"/>
               </w:rPr>
@@ -332,7 +332,7 @@
               <w:spacing w:before="0" w:after="80"/>
               <w:rPr>
                 <w:rFonts w:ascii="Calibri" w:hAnsi="Calibri" w:cs="Calibri"/>
-                <w:color w:val="FFFFFF"/>
+                <w:color w:val="1A202C"/>
                 <w:sz w:val="17"/>
                 <w:szCs w:val="17"/>
               </w:rPr>
@@ -341,12 +341,12 @@
           <w:p>
             <w:pPr>
               <w:pBdr>
-                <w:bottom w:val="single" w:sz="4" w:space="1" w:color="FFFFFF"/>
+                <w:bottom w:val="single" w:sz="4" w:space="1" w:color="4A86C8"/>
               </w:pBdr>
               <w:spacing w:before="200" w:after="80"/>
               <w:rPr>
                 <w:rFonts w:ascii="Calibri" w:hAnsi="Calibri" w:cs="Calibri"/>
-                <w:color w:val="FFFFFF"/>
+                <w:color w:val="1B3A52"/>
                 <w:b/>
                 <w:bCs/>
                 <w:sz w:val="20"/>
@@ -356,7 +356,7 @@
             <w:r>
               <w:rPr>
                 <w:rFonts w:ascii="Calibri" w:hAnsi="Calibri" w:cs="Calibri"/>
-                <w:color w:val="FFFFFF"/>
+                <w:color w:val="1B3A52"/>
                 <w:b/>
                 <w:bCs/>
                 <w:sz w:val="20"/>
@@ -378,7 +378,7 @@
               <w:spacing w:before="0" w:after="60"/>
               <w:rPr>
                 <w:rFonts w:ascii="Calibri" w:hAnsi="Calibri" w:cs="Calibri"/>
-                <w:color w:val="FFFFFF"/>
+                <w:color w:val="1A202C"/>
                 <w:sz w:val="17"/>
                 <w:szCs w:val="17"/>
               </w:rPr>
@@ -386,7 +386,7 @@
             <w:r>
               <w:rPr>
                 <w:rFonts w:ascii="Calibri" w:hAnsi="Calibri" w:cs="Calibri"/>
-                <w:color w:val="FFFFFF"/>
+                <w:color w:val="1A202C"/>
                 <w:sz w:val="17"/>
                 <w:szCs w:val="17"/>
               </w:rPr>
@@ -500,9 +500,17 @@
           <w:p>
             <w:pPr>
               <w:spacing w:before="0" w:after="0"/>
-              <w:rPr>
-                <w:rFonts w:ascii="Calibri" w:hAnsi="Calibri" w:cs="Calibri"/>
-                <w:color w:val="718096"/>
+            </w:pPr>
+            <w:r>
+              <w:t>{#degreeType}</w:t>
+            </w:r>
+          </w:p>
+          <w:p>
+            <w:pPr>
+              <w:spacing w:before="0" w:after="0"/>
+              <w:rPr>
+                <w:rFonts w:ascii="Calibri" w:hAnsi="Calibri" w:cs="Calibri"/>
+                <w:color w:val="4A5568"/>
                 <w:sz w:val="18"/>
                 <w:szCs w:val="18"/>
               </w:rPr>
@@ -510,7 +518,7 @@
             <w:r>
               <w:rPr>
                 <w:rFonts w:ascii="Calibri" w:hAnsi="Calibri" w:cs="Calibri"/>
-                <w:color w:val="718096"/>
+                <w:color w:val="4A5568"/>
                 <w:sz w:val="18"/>
                 <w:szCs w:val="18"/>
               </w:rPr>
@@ -520,9 +528,25 @@
           <w:p>
             <w:pPr>
               <w:spacing w:before="0" w:after="0"/>
-              <w:rPr>
-                <w:rFonts w:ascii="Calibri" w:hAnsi="Calibri" w:cs="Calibri"/>
-                <w:color w:val="718096"/>
+            </w:pPr>
+            <w:r>
+              <w:t>{/degreeType}</w:t>
+            </w:r>
+          </w:p>
+          <w:p>
+            <w:pPr>
+              <w:spacing w:before="0" w:after="0"/>
+            </w:pPr>
+            <w:r>
+              <w:t>{#specialization}</w:t>
+            </w:r>
+          </w:p>
+          <w:p>
+            <w:pPr>
+              <w:spacing w:before="0" w:after="0"/>
+              <w:rPr>
+                <w:rFonts w:ascii="Calibri" w:hAnsi="Calibri" w:cs="Calibri"/>
+                <w:color w:val="4A5568"/>
                 <w:sz w:val="18"/>
                 <w:szCs w:val="18"/>
               </w:rPr>
@@ -530,7 +554,7 @@
             <w:r>
               <w:rPr>
                 <w:rFonts w:ascii="Calibri" w:hAnsi="Calibri" w:cs="Calibri"/>
-                <w:color w:val="718096"/>
+                <w:color w:val="4A5568"/>
                 <w:sz w:val="18"/>
                 <w:szCs w:val="18"/>
               </w:rPr>
@@ -540,9 +564,17 @@
           <w:p>
             <w:pPr>
               <w:spacing w:before="0" w:after="0"/>
-              <w:rPr>
-                <w:rFonts w:ascii="Calibri" w:hAnsi="Calibri" w:cs="Calibri"/>
-                <w:color w:val="718096"/>
+            </w:pPr>
+            <w:r>
+              <w:t>{/specialization}</w:t>
+            </w:r>
+          </w:p>
+          <w:p>
+            <w:pPr>
+              <w:spacing w:before="0" w:after="0"/>
+              <w:rPr>
+                <w:rFonts w:ascii="Calibri" w:hAnsi="Calibri" w:cs="Calibri"/>
+                <w:color w:val="4A5568"/>
                 <w:sz w:val="18"/>
                 <w:szCs w:val="18"/>
               </w:rPr>
@@ -550,7 +582,7 @@
             <w:r>
               <w:rPr>
                 <w:rFonts w:ascii="Calibri" w:hAnsi="Calibri" w:cs="Calibri"/>
-                <w:color w:val="718096"/>
+                <w:color w:val="4A5568"/>
                 <w:sz w:val="18"/>
                 <w:szCs w:val="18"/>
               </w:rPr>
@@ -632,6 +664,14 @@
           <w:p>
             <w:pPr>
               <w:spacing w:before="0" w:after="0"/>
+            </w:pPr>
+            <w:r>
+              <w:t>{#projectText}</w:t>
+            </w:r>
+          </w:p>
+          <w:p>
+            <w:pPr>
+              <w:spacing w:before="0" w:after="0"/>
               <w:rPr>
                 <w:rFonts w:ascii="Calibri" w:hAnsi="Calibri" w:cs="Calibri"/>
                 <w:color w:val="2B6CB0"/>
@@ -656,9 +696,25 @@
           <w:p>
             <w:pPr>
               <w:spacing w:before="0" w:after="0"/>
-              <w:rPr>
-                <w:rFonts w:ascii="Calibri" w:hAnsi="Calibri" w:cs="Calibri"/>
-                <w:color w:val="718096"/>
+            </w:pPr>
+            <w:r>
+              <w:t>{/projectText}</w:t>
+            </w:r>
+          </w:p>
+          <w:p>
+            <w:pPr>
+              <w:spacing w:before="0" w:after="0"/>
+            </w:pPr>
+            <w:r>
+              <w:t>{#roleName}</w:t>
+            </w:r>
+          </w:p>
+          <w:p>
+            <w:pPr>
+              <w:spacing w:before="0" w:after="0"/>
+              <w:rPr>
+                <w:rFonts w:ascii="Calibri" w:hAnsi="Calibri" w:cs="Calibri"/>
+                <w:color w:val="4A5568"/>
                 <w:sz w:val="18"/>
                 <w:szCs w:val="18"/>
               </w:rPr>
@@ -666,7 +722,7 @@
             <w:r>
               <w:rPr>
                 <w:rFonts w:ascii="Calibri" w:hAnsi="Calibri" w:cs="Calibri"/>
-                <w:color w:val="718096"/>
+                <w:color w:val="4A5568"/>
                 <w:sz w:val="18"/>
                 <w:szCs w:val="18"/>
               </w:rPr>
@@ -676,9 +732,17 @@
           <w:p>
             <w:pPr>
               <w:spacing w:before="0" w:after="0"/>
-              <w:rPr>
-                <w:rFonts w:ascii="Calibri" w:hAnsi="Calibri" w:cs="Calibri"/>
-                <w:color w:val="718096"/>
+            </w:pPr>
+            <w:r>
+              <w:t>{/roleName}</w:t>
+            </w:r>
+          </w:p>
+          <w:p>
+            <w:pPr>
+              <w:spacing w:before="0" w:after="0"/>
+              <w:rPr>
+                <w:rFonts w:ascii="Calibri" w:hAnsi="Calibri" w:cs="Calibri"/>
+                <w:color w:val="4A5568"/>
                 <w:sz w:val="18"/>
                 <w:szCs w:val="18"/>
               </w:rPr>
@@ -686,7 +750,7 @@
             <w:r>
               <w:rPr>
                 <w:rFonts w:ascii="Calibri" w:hAnsi="Calibri" w:cs="Calibri"/>
-                <w:color w:val="718096"/>
+                <w:color w:val="4A5568"/>
                 <w:sz w:val="18"/>
                 <w:szCs w:val="18"/>
               </w:rPr>
@@ -746,7 +810,7 @@
               <w:spacing w:before="0" w:after="0"/>
               <w:rPr>
                 <w:rFonts w:ascii="Calibri" w:hAnsi="Calibri" w:cs="Calibri"/>
-                <w:color w:val="718096"/>
+                <w:color w:val="4A5568"/>
                 <w:sz w:val="18"/>
                 <w:szCs w:val="18"/>
               </w:rPr>
@@ -754,7 +818,7 @@
             <w:r>
               <w:rPr>
                 <w:rFonts w:ascii="Calibri" w:hAnsi="Calibri" w:cs="Calibri"/>
-                <w:color w:val="718096"/>
+                <w:color w:val="4A5568"/>
                 <w:sz w:val="18"/>
                 <w:szCs w:val="18"/>
               </w:rPr>

</xml_diff>

<commit_message>
CV sidebar: nested blue/gray layout, white photo ring, Montserrat, icons
- Sidebar split into inner nested table: blue top row (photo) + gray body row
- Photo circle now has a 4.5pt white ring border (a:ln in pic:spPr)
- Font changed to Montserrat (falls back to Calibri if not installed)
- Sidebar section headers now have emoji icons: ☎ Contact, 👤 About Me, ⭐ Skills
- Contact lines have ☎/✉/📍 Segoe UI Emoji icon prefixes
- Right-column section headers have 🎓 Education / 💼 Experience icons
- Each education/experience entry prefixed with blue ● bullet
- Outer sidebar cell gray fill matches inner gray row to avoid color gaps

Co-Authored-By: Claude Sonnet 4.6 <noreply@anthropic.com>
</commit_message>
<xml_diff>
--- a/backend/templates/cv_sidebar_blue_placeholders.docx
+++ b/backend/templates/cv_sidebar_blue_placeholders.docx
@@ -16,8 +16,8 @@
         <w:tblLook w:val="0000" w:firstRow="0" w:lastRow="0" w:firstColumn="0" w:lastColumn="0" w:noHBand="0" w:noVBand="0"/>
       </w:tblPr>
       <w:tblGrid>
-        <w:gridCol w:w="3203"/>
-        <w:gridCol w:w="6437"/>
+        <w:gridCol w:w="3200"/>
+        <w:gridCol w:w="6440"/>
       </w:tblGrid>
       <w:tr>
         <w:trPr>
@@ -26,380 +26,405 @@
         <w:tc>
           <w:tcPr>
             <w:tcW w:w="1750" w:type="pct"/>
-            <w:shd w:val="clear" w:color="auto" w:fill="7AB2D3"/>
+            <w:shd w:val="clear" w:color="auto" w:fill="F0F0F0"/>
             <w:tcMar>
               <w:top w:w="0" w:type="dxa"/>
-              <w:left w:w="200" w:type="dxa"/>
-              <w:right w:w="200" w:type="dxa"/>
+              <w:left w:w="0" w:type="dxa"/>
+              <w:right w:w="0" w:type="dxa"/>
               <w:bottom w:w="0" w:type="dxa"/>
             </w:tcMar>
             <w:vAlign w:val="top"/>
           </w:tcPr>
-          <w:p>
-            <w:pPr>
-              <w:spacing w:before="240" w:after="120"/>
-              <w:jc w:val="center"/>
-            </w:pPr>
-            <w:r>
-              <w:rPr>
-                <w:noProof/>
-              </w:rPr>
-              <w:drawing>
-                <wp:inline distT="0" distB="0" distL="0" distR="0">
-                  <wp:extent cx="1800000" cy="1800000"/>
-                  <wp:effectExtent l="0" t="0" r="0" b="0"/>
-                  <wp:docPr id="201" name="EmployeePhoto"/>
-                  <wp:cNvGraphicFramePr>
-                    <a:graphicFrameLocks xmlns:a="http://schemas.openxmlformats.org/drawingml/2006/main" noChangeAspect="1"/>
-                  </wp:cNvGraphicFramePr>
-                  <a:graphic xmlns:a="http://schemas.openxmlformats.org/drawingml/2006/main">
-                    <a:graphicData uri="http://schemas.openxmlformats.org/drawingml/2006/picture">
-                      <pic:pic xmlns:pic="http://schemas.openxmlformats.org/drawingml/2006/picture">
-                        <pic:nvPicPr>
-                          <pic:cNvPr id="0" name="EmployeePhoto"/>
-                          <pic:cNvPicPr>
-                            <a:picLocks noChangeAspect="1"/>
-                          </pic:cNvPicPr>
-                        </pic:nvPicPr>
-                        <pic:blipFill>
-                          <a:blip r:embed="rId_employee_photo"/>
-                          <a:stretch>
-                            <a:fillRect/>
-                          </a:stretch>
-                        </pic:blipFill>
-                        <pic:spPr>
-                          <a:xfrm>
-                            <a:off x="0" y="0"/>
-                            <a:ext cx="1800000" cy="1800000"/>
-                          </a:xfrm>
-                          <a:prstGeom prst="ellipse">
-                            <a:avLst/>
-                          </a:prstGeom>
-                        </pic:spPr>
-                      </pic:pic>
-                    </a:graphicData>
-                  </a:graphic>
-                </wp:inline>
-              </w:drawing>
-            </w:r>
-          </w:p>
-          <w:p>
-            <w:pPr>
-              <w:spacing w:before="0" w:after="40"/>
-              <w:jc w:val="center"/>
-              <w:rPr>
-                <w:rFonts w:ascii="Calibri" w:hAnsi="Calibri" w:cs="Calibri"/>
-                <w:color w:val="1B3A52"/>
-                <w:b/>
-                <w:bCs/>
-                <w:sz w:val="36"/>
-                <w:szCs w:val="36"/>
-              </w:rPr>
-            </w:pPr>
-            <w:r>
-              <w:rPr>
-                <w:rFonts w:ascii="Calibri" w:hAnsi="Calibri" w:cs="Calibri"/>
-                <w:color w:val="1B3A52"/>
-                <w:b/>
-                <w:bCs/>
-                <w:sz w:val="36"/>
-                <w:szCs w:val="36"/>
-              </w:rPr>
-              <w:t xml:space="preserve">{firstName} {lastName}</w:t>
-            </w:r>
-          </w:p>
-          <w:p>
-            <w:pPr>
-              <w:spacing w:before="0" w:after="160"/>
-              <w:jc w:val="center"/>
-              <w:rPr>
-                <w:rFonts w:ascii="Calibri" w:hAnsi="Calibri" w:cs="Calibri"/>
-                <w:color w:val="1A202C"/>
-                <w:sz w:val="18"/>
-                <w:szCs w:val="18"/>
-              </w:rPr>
-            </w:pPr>
-            <w:r>
-              <w:rPr>
-                <w:rFonts w:ascii="Calibri" w:hAnsi="Calibri" w:cs="Calibri"/>
-                <w:color w:val="1A202C"/>
-                <w:sz w:val="18"/>
-                <w:szCs w:val="18"/>
-              </w:rPr>
-              <w:t xml:space="preserve">{department}</w:t>
-            </w:r>
-          </w:p>
-          <w:p>
-            <w:pPr>
-              <w:pBdr>
-                <w:bottom w:val="single" w:sz="4" w:space="1" w:color="4A86C8"/>
-              </w:pBdr>
-              <w:spacing w:before="200" w:after="80"/>
-              <w:rPr>
-                <w:rFonts w:ascii="Calibri" w:hAnsi="Calibri" w:cs="Calibri"/>
-                <w:color w:val="1B3A52"/>
-                <w:b/>
-                <w:bCs/>
-                <w:sz w:val="20"/>
-                <w:szCs w:val="20"/>
-              </w:rPr>
-            </w:pPr>
-            <w:r>
-              <w:rPr>
-                <w:rFonts w:ascii="Calibri" w:hAnsi="Calibri" w:cs="Calibri"/>
-                <w:color w:val="1B3A52"/>
-                <w:b/>
-                <w:bCs/>
-                <w:sz w:val="20"/>
-                <w:szCs w:val="20"/>
-              </w:rPr>
-              <w:t xml:space="preserve">ΕΠΙΚΟΙΝΩΝΙΑ</w:t>
-            </w:r>
-          </w:p>
-          <w:p>
-            <w:pPr>
-              <w:spacing w:before="0" w:after="60"/>
-              <w:rPr>
-                <w:rFonts w:ascii="Calibri" w:hAnsi="Calibri" w:cs="Calibri"/>
-                <w:color w:val="1A202C"/>
-                <w:sz w:val="17"/>
-                <w:szCs w:val="17"/>
-              </w:rPr>
-            </w:pPr>
-            <w:r>
-              <w:rPr>
-                <w:rFonts w:ascii="Calibri" w:hAnsi="Calibri" w:cs="Calibri"/>
-                <w:color w:val="1A202C"/>
-                <w:sz w:val="17"/>
-                <w:szCs w:val="17"/>
-              </w:rPr>
-              <w:t xml:space="preserve">Τηλ: {phone}</w:t>
-            </w:r>
-          </w:p>
-          <w:p>
-            <w:pPr>
-              <w:spacing w:before="0" w:after="60"/>
-              <w:rPr>
-                <w:rFonts w:ascii="Calibri" w:hAnsi="Calibri" w:cs="Calibri"/>
-                <w:color w:val="1A202C"/>
-                <w:sz w:val="17"/>
-                <w:szCs w:val="17"/>
-              </w:rPr>
-            </w:pPr>
-            <w:r>
-              <w:rPr>
-                <w:rFonts w:ascii="Calibri" w:hAnsi="Calibri" w:cs="Calibri"/>
-                <w:color w:val="1A202C"/>
-                <w:sz w:val="17"/>
-                <w:szCs w:val="17"/>
-              </w:rPr>
-              <w:t xml:space="preserve">Email: {email}</w:t>
-            </w:r>
-          </w:p>
-          <w:p>
-            <w:pPr>
-              <w:spacing w:before="0" w:after="60"/>
-              <w:rPr>
-                <w:rFonts w:ascii="Calibri" w:hAnsi="Calibri" w:cs="Calibri"/>
-                <w:color w:val="1A202C"/>
-                <w:sz w:val="17"/>
-                <w:szCs w:val="17"/>
-              </w:rPr>
-            </w:pPr>
-            <w:r>
-              <w:rPr>
-                <w:rFonts w:ascii="Calibri" w:hAnsi="Calibri" w:cs="Calibri"/>
-                <w:color w:val="1A202C"/>
-                <w:sz w:val="17"/>
-                <w:szCs w:val="17"/>
-              </w:rPr>
-              <w:t xml:space="preserve">{homeAddress}</w:t>
-            </w:r>
-          </w:p>
-          <w:p>
-            <w:pPr>
-              <w:spacing w:before="0" w:after="60"/>
-              <w:rPr>
-                <w:rFonts w:ascii="Calibri" w:hAnsi="Calibri" w:cs="Calibri"/>
-                <w:color w:val="1A202C"/>
-                <w:sz w:val="17"/>
-                <w:szCs w:val="17"/>
-              </w:rPr>
-            </w:pPr>
-            <w:r>
-              <w:rPr>
-                <w:rFonts w:ascii="Calibri" w:hAnsi="Calibri" w:cs="Calibri"/>
-                <w:color w:val="1A202C"/>
-                <w:sz w:val="17"/>
-                <w:szCs w:val="17"/>
-              </w:rPr>
-              <w:t xml:space="preserve">Ημ/νία: {dateOfBirth}</w:t>
-            </w:r>
-          </w:p>
-          <w:p>
-            <w:pPr>
-              <w:spacing w:before="0" w:after="60"/>
-              <w:rPr>
-                <w:rFonts w:ascii="Calibri" w:hAnsi="Calibri" w:cs="Calibri"/>
-                <w:color w:val="1A202C"/>
-                <w:sz w:val="17"/>
-                <w:szCs w:val="17"/>
-              </w:rPr>
-            </w:pPr>
-            <w:r>
-              <w:rPr>
-                <w:rFonts w:ascii="Calibri" w:hAnsi="Calibri" w:cs="Calibri"/>
-                <w:color w:val="1A202C"/>
-                <w:sz w:val="17"/>
-                <w:szCs w:val="17"/>
-              </w:rPr>
-              <w:t xml:space="preserve">Τόπος: {placeOfBirth}</w:t>
-            </w:r>
-          </w:p>
-          <w:p>
-            <w:pPr>
-              <w:spacing w:before="0" w:after="80"/>
-              <w:rPr>
-                <w:rFonts w:ascii="Calibri" w:hAnsi="Calibri" w:cs="Calibri"/>
-                <w:color w:val="1A202C"/>
-                <w:sz w:val="17"/>
-                <w:szCs w:val="17"/>
-              </w:rPr>
-            </w:pPr>
-          </w:p>
-          <w:p>
-            <w:pPr>
-              <w:pBdr>
-                <w:bottom w:val="single" w:sz="4" w:space="1" w:color="4A86C8"/>
-              </w:pBdr>
-              <w:spacing w:before="200" w:after="80"/>
-              <w:rPr>
-                <w:rFonts w:ascii="Calibri" w:hAnsi="Calibri" w:cs="Calibri"/>
-                <w:color w:val="1B3A52"/>
-                <w:b/>
-                <w:bCs/>
-                <w:sz w:val="20"/>
-                <w:szCs w:val="20"/>
-              </w:rPr>
-            </w:pPr>
-            <w:r>
-              <w:rPr>
-                <w:rFonts w:ascii="Calibri" w:hAnsi="Calibri" w:cs="Calibri"/>
-                <w:color w:val="1B3A52"/>
-                <w:b/>
-                <w:bCs/>
-                <w:sz w:val="20"/>
-                <w:szCs w:val="20"/>
-              </w:rPr>
-              <w:t xml:space="preserve">ΣΧΕΤΙΚΑ ΜΕ ΕΜΕΝΑ</w:t>
-            </w:r>
-          </w:p>
-          <w:p>
-            <w:pPr>
-              <w:spacing w:before="0" w:after="80"/>
-              <w:rPr>
-                <w:rFonts w:ascii="Calibri" w:hAnsi="Calibri" w:cs="Calibri"/>
-                <w:color w:val="1A202C"/>
-                <w:sz w:val="17"/>
-                <w:szCs w:val="17"/>
-              </w:rPr>
-            </w:pPr>
-          </w:p>
-          <w:p>
-            <w:pPr>
-              <w:spacing w:before="0" w:after="80"/>
-              <w:rPr>
-                <w:rFonts w:ascii="Calibri" w:hAnsi="Calibri" w:cs="Calibri"/>
-                <w:color w:val="1A202C"/>
-                <w:sz w:val="17"/>
-                <w:szCs w:val="17"/>
-              </w:rPr>
-            </w:pPr>
-          </w:p>
-          <w:p>
-            <w:pPr>
-              <w:spacing w:before="0" w:after="80"/>
-              <w:rPr>
-                <w:rFonts w:ascii="Calibri" w:hAnsi="Calibri" w:cs="Calibri"/>
-                <w:color w:val="1A202C"/>
-                <w:sz w:val="17"/>
-                <w:szCs w:val="17"/>
-              </w:rPr>
-            </w:pPr>
-          </w:p>
-          <w:p>
-            <w:pPr>
-              <w:spacing w:before="0" w:after="80"/>
-              <w:rPr>
-                <w:rFonts w:ascii="Calibri" w:hAnsi="Calibri" w:cs="Calibri"/>
-                <w:color w:val="1A202C"/>
-                <w:sz w:val="17"/>
-                <w:szCs w:val="17"/>
-              </w:rPr>
-            </w:pPr>
-          </w:p>
-          <w:p>
-            <w:pPr>
-              <w:pBdr>
-                <w:bottom w:val="single" w:sz="4" w:space="1" w:color="4A86C8"/>
-              </w:pBdr>
-              <w:spacing w:before="200" w:after="80"/>
-              <w:rPr>
-                <w:rFonts w:ascii="Calibri" w:hAnsi="Calibri" w:cs="Calibri"/>
-                <w:color w:val="1B3A52"/>
-                <w:b/>
-                <w:bCs/>
-                <w:sz w:val="20"/>
-                <w:szCs w:val="20"/>
-              </w:rPr>
-            </w:pPr>
-            <w:r>
-              <w:rPr>
-                <w:rFonts w:ascii="Calibri" w:hAnsi="Calibri" w:cs="Calibri"/>
-                <w:color w:val="1B3A52"/>
-                <w:b/>
-                <w:bCs/>
-                <w:sz w:val="20"/>
-                <w:szCs w:val="20"/>
-              </w:rPr>
-              <w:t xml:space="preserve">ΓΝΩΣΕΙΣ</w:t>
-            </w:r>
-          </w:p>
+          <w:tbl>
+            <w:tblPr>
+              <w:tblW w:w="5000" w:type="pct"/>
+              <w:tblBorders>
+                <w:top w:val="none" w:sz="0" w:space="0" w:color="auto"/>
+                <w:left w:val="none" w:sz="0" w:space="0" w:color="auto"/>
+                <w:bottom w:val="none" w:sz="0" w:space="0" w:color="auto"/>
+                <w:right w:val="none" w:sz="0" w:space="0" w:color="auto"/>
+                <w:insideH w:val="none" w:sz="0" w:space="0" w:color="auto"/>
+                <w:insideV w:val="none" w:sz="0" w:space="0" w:color="auto"/>
+              </w:tblBorders>
+              <w:tblCellMar>
+                <w:top w:w="0" w:type="dxa"/>
+                <w:left w:w="0" w:type="dxa"/>
+                <w:right w:w="0" w:type="dxa"/>
+                <w:bottom w:w="0" w:type="dxa"/>
+              </w:tblCellMar>
+            </w:tblPr>
+            <w:tblGrid>
+              <w:gridCol w:w="3200"/>
+            </w:tblGrid>
+            <w:tr>
+              <w:tc>
+                <w:tcPr>
+                  <w:tcW w:w="5000" w:type="pct"/>
+                  <w:shd w:val="clear" w:color="auto" w:fill="4472C4"/>
+                  <w:tcMar>
+                    <w:top w:w="0" w:type="dxa"/>
+                    <w:left w:w="200" w:type="dxa"/>
+                    <w:right w:w="200" w:type="dxa"/>
+                    <w:bottom w:w="0" w:type="dxa"/>
+                  </w:tcMar>
+                </w:tcPr>
+                <w:p>
+                  <w:pPr>
+                    <w:spacing w:before="300" w:after="200"/>
+                    <w:jc w:val="center"/>
+                  </w:pPr>
+                  <w:r>
+                    <w:rPr>
+                      <w:noProof/>
+                    </w:rPr>
+                    <w:drawing>
+                      <wp:inline distT="0" distB="0" distL="0" distR="0">
+                        <wp:extent cx="1800000" cy="1800000"/>
+                        <wp:effectExtent l="0" t="0" r="0" b="0"/>
+                        <wp:docPr id="201" name="EmployeePhoto"/>
+                        <wp:cNvGraphicFramePr>
+                          <a:graphicFrameLocks xmlns:a="http://schemas.openxmlformats.org/drawingml/2006/main" noChangeAspect="1"/>
+                        </wp:cNvGraphicFramePr>
+                        <a:graphic xmlns:a="http://schemas.openxmlformats.org/drawingml/2006/main">
+                          <a:graphicData uri="http://schemas.openxmlformats.org/drawingml/2006/picture">
+                            <pic:pic xmlns:pic="http://schemas.openxmlformats.org/drawingml/2006/picture">
+                              <pic:nvPicPr>
+                                <pic:cNvPr id="0" name="EmployeePhoto"/>
+                                <pic:cNvPicPr>
+                                  <a:picLocks noChangeAspect="1"/>
+                                </pic:cNvPicPr>
+                              </pic:nvPicPr>
+                              <pic:blipFill>
+                                <a:blip r:embed="rId_employee_photo"/>
+                                <a:stretch>
+                                  <a:fillRect/>
+                                </a:stretch>
+                              </pic:blipFill>
+                              <pic:spPr>
+                                <a:xfrm>
+                                  <a:off x="0" y="0"/>
+                                  <a:ext cx="1800000" cy="1800000"/>
+                                </a:xfrm>
+                                <a:prstGeom prst="ellipse">
+                                  <a:avLst/>
+                                </a:prstGeom>
+                                <a:ln w="57150">
+                                  <a:solidFill>
+                                    <a:srgbClr val="FFFFFF"/>
+                                  </a:solidFill>
+                                </a:ln>
+                              </pic:spPr>
+                            </pic:pic>
+                          </a:graphicData>
+                        </a:graphic>
+                      </wp:inline>
+                    </w:drawing>
+                  </w:r>
+                </w:p>
+              </w:tc>
+            </w:tr>
+            <w:tr>
+              <w:tc>
+                <w:tcPr>
+                  <w:tcW w:w="5000" w:type="pct"/>
+                  <w:shd w:val="clear" w:color="auto" w:fill="F0F0F0"/>
+                  <w:tcMar>
+                    <w:top w:w="120" w:type="dxa"/>
+                    <w:left w:w="200" w:type="dxa"/>
+                    <w:right w:w="200" w:type="dxa"/>
+                    <w:bottom w:w="0" w:type="dxa"/>
+                  </w:tcMar>
+                </w:tcPr>
+                <w:p>
+                  <w:pPr>
+                    <w:spacing w:before="0" w:after="40"/>
+                    <w:jc w:val="center"/>
+                  </w:pPr>
+                  <w:r>
+                    <w:rPr>
+                      <w:rFonts w:ascii="Montserrat" w:hAnsi="Montserrat" w:cs="Calibri"/>
+                      <w:color w:val="2D2D2D"/>
+                      <w:b/>
+                      <w:bCs/>
+                      <w:sz w:val="40"/>
+                      <w:szCs w:val="40"/>
+                    </w:rPr>
+                    <w:t xml:space="preserve">{firstName} {lastName}</w:t>
+                  </w:r>
+                </w:p>
+                <w:p>
+                  <w:pPr>
+                    <w:spacing w:before="0" w:after="160"/>
+                    <w:jc w:val="center"/>
+                  </w:pPr>
+                  <w:r>
+                    <w:rPr>
+                      <w:rFonts w:ascii="Montserrat" w:hAnsi="Montserrat" w:cs="Calibri"/>
+                      <w:color w:val="555555"/>
+                      <w:sz w:val="18"/>
+                      <w:szCs w:val="18"/>
+                    </w:rPr>
+                    <w:t xml:space="preserve">{department}</w:t>
+                  </w:r>
+                </w:p>
+                <w:p>
+                  <w:pPr>
+                    <w:pBdr>
+                      <w:bottom w:val="single" w:sz="6" w:space="1" w:color="4472C4"/>
+                    </w:pBdr>
+                    <w:spacing w:before="180" w:after="80"/>
+                  </w:pPr>
+                  <w:r>
+                    <w:rPr>
+                      <w:rFonts w:ascii="Segoe UI Symbol" w:hAnsi="Segoe UI Symbol" w:cs="Segoe UI Symbol"/>
+                      <w:color w:val="4472C4"/>
+                      <w:sz w:val="22"/>
+                      <w:szCs w:val="22"/>
+                    </w:rPr>
+                    <w:t xml:space="preserve">☎ </w:t>
+                  </w:r>
+                  <w:r>
+                    <w:rPr>
+                      <w:rFonts w:ascii="Montserrat" w:hAnsi="Montserrat" w:cs="Calibri"/>
+                      <w:color w:val="2D2D2D"/>
+                      <w:b/>
+                      <w:bCs/>
+                      <w:sz w:val="22"/>
+                      <w:szCs w:val="22"/>
+                    </w:rPr>
+                    <w:t xml:space="preserve">Contact</w:t>
+                  </w:r>
+                </w:p>
+                <w:p>
+                  <w:pPr>
+                    <w:spacing w:before="0" w:after="60"/>
+                  </w:pPr>
+                  <w:r>
+                    <w:rPr>
+                      <w:rFonts w:ascii="Segoe UI Symbol" w:hAnsi="Segoe UI Symbol" w:cs="Segoe UI Symbol"/>
+                      <w:color w:val="4472C4"/>
+                      <w:sz w:val="17"/>
+                      <w:szCs w:val="17"/>
+                    </w:rPr>
+                    <w:t xml:space="preserve">☎ </w:t>
+                  </w:r>
+                  <w:r>
+                    <w:rPr>
+                      <w:rFonts w:ascii="Montserrat" w:hAnsi="Montserrat" w:cs="Calibri"/>
+                      <w:color w:val="555555"/>
+                      <w:sz w:val="17"/>
+                      <w:szCs w:val="17"/>
+                    </w:rPr>
+                    <w:t xml:space="preserve">{phone}</w:t>
+                  </w:r>
+                </w:p>
+                <w:p>
+                  <w:pPr>
+                    <w:spacing w:before="0" w:after="60"/>
+                  </w:pPr>
+                  <w:r>
+                    <w:rPr>
+                      <w:rFonts w:ascii="Segoe UI Symbol" w:hAnsi="Segoe UI Symbol" w:cs="Segoe UI Symbol"/>
+                      <w:color w:val="4472C4"/>
+                      <w:sz w:val="17"/>
+                      <w:szCs w:val="17"/>
+                    </w:rPr>
+                    <w:t xml:space="preserve">✉ </w:t>
+                  </w:r>
+                  <w:r>
+                    <w:rPr>
+                      <w:rFonts w:ascii="Montserrat" w:hAnsi="Montserrat" w:cs="Calibri"/>
+                      <w:color w:val="555555"/>
+                      <w:sz w:val="17"/>
+                      <w:szCs w:val="17"/>
+                    </w:rPr>
+                    <w:t xml:space="preserve">{email}</w:t>
+                  </w:r>
+                </w:p>
+                <w:p>
+                  <w:pPr>
+                    <w:spacing w:before="0" w:after="60"/>
+                  </w:pPr>
+                  <w:r>
+                    <w:rPr>
+                      <w:rFonts w:ascii="Segoe UI Emoji" w:hAnsi="Segoe UI Emoji" w:cs="Segoe UI Emoji"/>
+                      <w:color w:val="4472C4"/>
+                      <w:sz w:val="17"/>
+                      <w:szCs w:val="17"/>
+                    </w:rPr>
+                    <w:t xml:space="preserve">📍 </w:t>
+                  </w:r>
+                  <w:r>
+                    <w:rPr>
+                      <w:rFonts w:ascii="Montserrat" w:hAnsi="Montserrat" w:cs="Calibri"/>
+                      <w:color w:val="555555"/>
+                      <w:sz w:val="17"/>
+                      <w:szCs w:val="17"/>
+                    </w:rPr>
+                    <w:t xml:space="preserve">{homeAddress}</w:t>
+                  </w:r>
+                </w:p>
+                <w:p>
+                  <w:pPr>
+                    <w:spacing w:before="0" w:after="60"/>
+                  </w:pPr>
+                  <w:r>
+                    <w:rPr>
+                      <w:rFonts w:ascii="Montserrat" w:hAnsi="Montserrat" w:cs="Calibri"/>
+                      <w:color w:val="555555"/>
+                      <w:sz w:val="17"/>
+                      <w:szCs w:val="17"/>
+                    </w:rPr>
+                    <w:t xml:space="preserve">Ημ/νία: {dateOfBirth}</w:t>
+                  </w:r>
+                </w:p>
+                <w:p>
+                  <w:pPr>
+                    <w:spacing w:before="0" w:after="60"/>
+                  </w:pPr>
+                  <w:r>
+                    <w:rPr>
+                      <w:rFonts w:ascii="Montserrat" w:hAnsi="Montserrat" w:cs="Calibri"/>
+                      <w:color w:val="555555"/>
+                      <w:sz w:val="17"/>
+                      <w:szCs w:val="17"/>
+                    </w:rPr>
+                    <w:t xml:space="preserve">Τόπος: {placeOfBirth}</w:t>
+                  </w:r>
+                </w:p>
+                <w:p>
+                  <w:pPr>
+                    <w:spacing w:before="0" w:after="100"/>
+                  </w:pPr>
+                </w:p>
+                <w:p>
+                  <w:pPr>
+                    <w:pBdr>
+                      <w:bottom w:val="single" w:sz="6" w:space="1" w:color="4472C4"/>
+                    </w:pBdr>
+                    <w:spacing w:before="180" w:after="80"/>
+                  </w:pPr>
+                  <w:r>
+                    <w:rPr>
+                      <w:rFonts w:ascii="Segoe UI Emoji" w:hAnsi="Segoe UI Emoji" w:cs="Segoe UI Emoji"/>
+                      <w:color w:val="4472C4"/>
+                      <w:sz w:val="22"/>
+                      <w:szCs w:val="22"/>
+                    </w:rPr>
+                    <w:t xml:space="preserve">👤 </w:t>
+                  </w:r>
+                  <w:r>
+                    <w:rPr>
+                      <w:rFonts w:ascii="Montserrat" w:hAnsi="Montserrat" w:cs="Calibri"/>
+                      <w:color w:val="2D2D2D"/>
+                      <w:b/>
+                      <w:bCs/>
+                      <w:sz w:val="22"/>
+                      <w:szCs w:val="22"/>
+                    </w:rPr>
+                    <w:t xml:space="preserve">About Me</w:t>
+                  </w:r>
+                </w:p>
+                <w:p>
+                  <w:pPr>
+                    <w:spacing w:before="0" w:after="100"/>
+                  </w:pPr>
+                </w:p>
+                <w:p>
+                  <w:pPr>
+                    <w:spacing w:before="0" w:after="100"/>
+                  </w:pPr>
+                </w:p>
+                <w:p>
+                  <w:pPr>
+                    <w:spacing w:before="0" w:after="100"/>
+                  </w:pPr>
+                </w:p>
+                <w:p>
+                  <w:pPr>
+                    <w:spacing w:before="0" w:after="100"/>
+                  </w:pPr>
+                </w:p>
+                <w:p>
+                  <w:pPr>
+                    <w:spacing w:before="0" w:after="100"/>
+                  </w:pPr>
+                </w:p>
+                <w:p>
+                  <w:pPr>
+                    <w:pBdr>
+                      <w:bottom w:val="single" w:sz="6" w:space="1" w:color="4472C4"/>
+                    </w:pBdr>
+                    <w:spacing w:before="180" w:after="80"/>
+                  </w:pPr>
+                  <w:r>
+                    <w:rPr>
+                      <w:rFonts w:ascii="Segoe UI Symbol" w:hAnsi="Segoe UI Symbol" w:cs="Segoe UI Symbol"/>
+                      <w:color w:val="4472C4"/>
+                      <w:sz w:val="22"/>
+                      <w:szCs w:val="22"/>
+                    </w:rPr>
+                    <w:t xml:space="preserve">⭐ </w:t>
+                  </w:r>
+                  <w:r>
+                    <w:rPr>
+                      <w:rFonts w:ascii="Montserrat" w:hAnsi="Montserrat" w:cs="Calibri"/>
+                      <w:color w:val="2D2D2D"/>
+                      <w:b/>
+                      <w:bCs/>
+                      <w:sz w:val="22"/>
+                      <w:szCs w:val="22"/>
+                    </w:rPr>
+                    <w:t xml:space="preserve">Skills</w:t>
+                  </w:r>
+                </w:p>
+                <w:p>
+                  <w:pPr>
+                    <w:spacing w:before="0" w:after="0"/>
+                  </w:pPr>
+                  <w:r>
+                    <w:t>{#skillRows}</w:t>
+                  </w:r>
+                </w:p>
+                <w:p>
+                  <w:pPr>
+                    <w:spacing w:before="0" w:after="60"/>
+                  </w:pPr>
+                  <w:r>
+                    <w:rPr>
+                      <w:rFonts w:ascii="Segoe UI Symbol" w:hAnsi="Segoe UI Symbol" w:cs="Segoe UI Symbol"/>
+                      <w:color w:val="4472C4"/>
+                      <w:sz w:val="17"/>
+                      <w:szCs w:val="17"/>
+                    </w:rPr>
+                    <w:t xml:space="preserve">▪ </w:t>
+                  </w:r>
+                  <w:r>
+                    <w:rPr>
+                      <w:rFonts w:ascii="Montserrat" w:hAnsi="Montserrat" w:cs="Calibri"/>
+                      <w:color w:val="555555"/>
+                      <w:sz w:val="17"/>
+                      <w:szCs w:val="17"/>
+                    </w:rPr>
+                    <w:t xml:space="preserve">{skillText}</w:t>
+                  </w:r>
+                </w:p>
+                <w:p>
+                  <w:pPr>
+                    <w:spacing w:before="0" w:after="0"/>
+                  </w:pPr>
+                  <w:r>
+                    <w:t>{/skillRows}</w:t>
+                  </w:r>
+                </w:p>
+              </w:tc>
+            </w:tr>
+          </w:tbl>
           <w:p>
             <w:pPr>
               <w:spacing w:before="0" w:after="0"/>
+              <w:shd w:val="clear" w:color="auto" w:fill="F0F0F0"/>
             </w:pPr>
-            <w:r>
-              <w:t>{#skillRows}</w:t>
-            </w:r>
-          </w:p>
-          <w:p>
-            <w:pPr>
-              <w:spacing w:before="0" w:after="60"/>
-              <w:rPr>
-                <w:rFonts w:ascii="Calibri" w:hAnsi="Calibri" w:cs="Calibri"/>
-                <w:color w:val="1A202C"/>
-                <w:sz w:val="17"/>
-                <w:szCs w:val="17"/>
-              </w:rPr>
-            </w:pPr>
-            <w:r>
-              <w:rPr>
-                <w:rFonts w:ascii="Calibri" w:hAnsi="Calibri" w:cs="Calibri"/>
-                <w:color w:val="1A202C"/>
-                <w:sz w:val="17"/>
-                <w:szCs w:val="17"/>
-              </w:rPr>
-              <w:t xml:space="preserve">• {skillText}</w:t>
-            </w:r>
-          </w:p>
-          <w:p>
-            <w:pPr>
-              <w:spacing w:before="0" w:after="0"/>
-            </w:pPr>
-            <w:r>
-              <w:t>{/skillRows}</w:t>
-            </w:r>
           </w:p>
         </w:tc>
         <w:tc>
@@ -409,7 +434,7 @@
             <w:tcMar>
               <w:top w:w="200" w:type="dxa"/>
               <w:left w:w="300" w:type="dxa"/>
-              <w:right w:w="200" w:type="dxa"/>
+              <w:right w:w="300" w:type="dxa"/>
               <w:bottom w:w="0" w:type="dxa"/>
             </w:tcMar>
             <w:vAlign w:val="top"/>
@@ -417,28 +442,29 @@
           <w:p>
             <w:pPr>
               <w:pBdr>
-                <w:bottom w:val="single" w:sz="6" w:space="1" w:color="2B6CB0"/>
+                <w:bottom w:val="single" w:sz="6" w:space="1" w:color="4472C4"/>
               </w:pBdr>
               <w:spacing w:before="280" w:after="80"/>
+            </w:pPr>
+            <w:r>
               <w:rPr>
-                <w:rFonts w:ascii="Calibri" w:hAnsi="Calibri" w:cs="Calibri"/>
-                <w:color w:val="2B6CB0"/>
+                <w:rFonts w:ascii="Segoe UI Emoji" w:hAnsi="Segoe UI Emoji" w:cs="Segoe UI Emoji"/>
+                <w:color w:val="4472C4"/>
+                <w:sz w:val="24"/>
+                <w:szCs w:val="24"/>
+              </w:rPr>
+              <w:t xml:space="preserve">🎓 </w:t>
+            </w:r>
+            <w:r>
+              <w:rPr>
+                <w:rFonts w:ascii="Montserrat" w:hAnsi="Montserrat" w:cs="Calibri"/>
+                <w:color w:val="4472C4"/>
                 <w:b/>
                 <w:bCs/>
                 <w:sz w:val="24"/>
                 <w:szCs w:val="24"/>
               </w:rPr>
-            </w:pPr>
-            <w:r>
-              <w:rPr>
-                <w:rFonts w:ascii="Calibri" w:hAnsi="Calibri" w:cs="Calibri"/>
-                <w:color w:val="2B6CB0"/>
-                <w:b/>
-                <w:bCs/>
-                <w:sz w:val="24"/>
-                <w:szCs w:val="24"/>
-              </w:rPr>
-              <w:t xml:space="preserve">ΕΚΠΑΙΔΕΥΣΗ</w:t>
+              <w:t xml:space="preserve">Education</w:t>
             </w:r>
           </w:p>
           <w:p>
@@ -452,19 +478,20 @@
           <w:p>
             <w:pPr>
               <w:spacing w:before="100" w:after="0"/>
-              <w:rPr>
-                <w:rFonts w:ascii="Calibri" w:hAnsi="Calibri" w:cs="Calibri"/>
-                <w:color w:val="1A202C"/>
-                <w:b/>
-                <w:bCs/>
-                <w:sz w:val="20"/>
-                <w:szCs w:val="20"/>
-              </w:rPr>
             </w:pPr>
             <w:r>
               <w:rPr>
                 <w:rFonts w:ascii="Calibri" w:hAnsi="Calibri" w:cs="Calibri"/>
-                <w:color w:val="1A202C"/>
+                <w:color w:val="4472C4"/>
+                <w:sz w:val="16"/>
+                <w:szCs w:val="16"/>
+              </w:rPr>
+              <w:t xml:space="preserve">● </w:t>
+            </w:r>
+            <w:r>
+              <w:rPr>
+                <w:rFonts w:ascii="Montserrat" w:hAnsi="Montserrat" w:cs="Calibri"/>
+                <w:color w:val="2D2D2D"/>
                 <w:b/>
                 <w:bCs/>
                 <w:sz w:val="20"/>
@@ -476,19 +503,11 @@
           <w:p>
             <w:pPr>
               <w:spacing w:before="0" w:after="0"/>
-              <w:rPr>
-                <w:rFonts w:ascii="Calibri" w:hAnsi="Calibri" w:cs="Calibri"/>
-                <w:color w:val="2B6CB0"/>
-                <w:i/>
-                <w:iCs/>
-                <w:sz w:val="18"/>
-                <w:szCs w:val="18"/>
-              </w:rPr>
             </w:pPr>
             <w:r>
               <w:rPr>
-                <w:rFonts w:ascii="Calibri" w:hAnsi="Calibri" w:cs="Calibri"/>
-                <w:color w:val="2B6CB0"/>
+                <w:rFonts w:ascii="Montserrat" w:hAnsi="Montserrat" w:cs="Calibri"/>
+                <w:color w:val="4472C4"/>
                 <w:i/>
                 <w:iCs/>
                 <w:sz w:val="18"/>
@@ -508,17 +527,11 @@
           <w:p>
             <w:pPr>
               <w:spacing w:before="0" w:after="0"/>
-              <w:rPr>
-                <w:rFonts w:ascii="Calibri" w:hAnsi="Calibri" w:cs="Calibri"/>
-                <w:color w:val="4A5568"/>
-                <w:sz w:val="18"/>
-                <w:szCs w:val="18"/>
-              </w:rPr>
             </w:pPr>
             <w:r>
               <w:rPr>
-                <w:rFonts w:ascii="Calibri" w:hAnsi="Calibri" w:cs="Calibri"/>
-                <w:color w:val="4A5568"/>
+                <w:rFonts w:ascii="Montserrat" w:hAnsi="Montserrat" w:cs="Calibri"/>
+                <w:color w:val="555555"/>
                 <w:sz w:val="18"/>
                 <w:szCs w:val="18"/>
               </w:rPr>
@@ -544,17 +557,11 @@
           <w:p>
             <w:pPr>
               <w:spacing w:before="0" w:after="0"/>
-              <w:rPr>
-                <w:rFonts w:ascii="Calibri" w:hAnsi="Calibri" w:cs="Calibri"/>
-                <w:color w:val="4A5568"/>
-                <w:sz w:val="18"/>
-                <w:szCs w:val="18"/>
-              </w:rPr>
             </w:pPr>
             <w:r>
               <w:rPr>
-                <w:rFonts w:ascii="Calibri" w:hAnsi="Calibri" w:cs="Calibri"/>
-                <w:color w:val="4A5568"/>
+                <w:rFonts w:ascii="Montserrat" w:hAnsi="Montserrat" w:cs="Calibri"/>
+                <w:color w:val="555555"/>
                 <w:sz w:val="18"/>
                 <w:szCs w:val="18"/>
               </w:rPr>
@@ -572,17 +579,11 @@
           <w:p>
             <w:pPr>
               <w:spacing w:before="0" w:after="0"/>
-              <w:rPr>
-                <w:rFonts w:ascii="Calibri" w:hAnsi="Calibri" w:cs="Calibri"/>
-                <w:color w:val="4A5568"/>
-                <w:sz w:val="18"/>
-                <w:szCs w:val="18"/>
-              </w:rPr>
             </w:pPr>
             <w:r>
               <w:rPr>
-                <w:rFonts w:ascii="Calibri" w:hAnsi="Calibri" w:cs="Calibri"/>
-                <w:color w:val="4A5568"/>
+                <w:rFonts w:ascii="Montserrat" w:hAnsi="Montserrat" w:cs="Calibri"/>
+                <w:color w:val="555555"/>
                 <w:sz w:val="18"/>
                 <w:szCs w:val="18"/>
               </w:rPr>
@@ -605,28 +606,29 @@
           <w:p>
             <w:pPr>
               <w:pBdr>
-                <w:bottom w:val="single" w:sz="6" w:space="1" w:color="2B6CB0"/>
+                <w:bottom w:val="single" w:sz="6" w:space="1" w:color="4472C4"/>
               </w:pBdr>
               <w:spacing w:before="280" w:after="80"/>
+            </w:pPr>
+            <w:r>
               <w:rPr>
-                <w:rFonts w:ascii="Calibri" w:hAnsi="Calibri" w:cs="Calibri"/>
-                <w:color w:val="2B6CB0"/>
+                <w:rFonts w:ascii="Segoe UI Emoji" w:hAnsi="Segoe UI Emoji" w:cs="Segoe UI Emoji"/>
+                <w:color w:val="4472C4"/>
+                <w:sz w:val="24"/>
+                <w:szCs w:val="24"/>
+              </w:rPr>
+              <w:t xml:space="preserve">💼 </w:t>
+            </w:r>
+            <w:r>
+              <w:rPr>
+                <w:rFonts w:ascii="Montserrat" w:hAnsi="Montserrat" w:cs="Calibri"/>
+                <w:color w:val="4472C4"/>
                 <w:b/>
                 <w:bCs/>
                 <w:sz w:val="24"/>
                 <w:szCs w:val="24"/>
               </w:rPr>
-            </w:pPr>
-            <w:r>
-              <w:rPr>
-                <w:rFonts w:ascii="Calibri" w:hAnsi="Calibri" w:cs="Calibri"/>
-                <w:color w:val="2B6CB0"/>
-                <w:b/>
-                <w:bCs/>
-                <w:sz w:val="24"/>
-                <w:szCs w:val="24"/>
-              </w:rPr>
-              <w:t xml:space="preserve">ΕΠΑΓΓΕΛΜΑΤΙΚΗ ΕΜΠΕΙΡΙΑ</w:t>
+              <w:t xml:space="preserve">Experience</w:t>
             </w:r>
           </w:p>
           <w:p>
@@ -640,19 +642,20 @@
           <w:p>
             <w:pPr>
               <w:spacing w:before="100" w:after="0"/>
-              <w:rPr>
-                <w:rFonts w:ascii="Calibri" w:hAnsi="Calibri" w:cs="Calibri"/>
-                <w:color w:val="1A202C"/>
-                <w:b/>
-                <w:bCs/>
-                <w:sz w:val="20"/>
-                <w:szCs w:val="20"/>
-              </w:rPr>
             </w:pPr>
             <w:r>
               <w:rPr>
                 <w:rFonts w:ascii="Calibri" w:hAnsi="Calibri" w:cs="Calibri"/>
-                <w:color w:val="1A202C"/>
+                <w:color w:val="4472C4"/>
+                <w:sz w:val="16"/>
+                <w:szCs w:val="16"/>
+              </w:rPr>
+              <w:t xml:space="preserve">● </w:t>
+            </w:r>
+            <w:r>
+              <w:rPr>
+                <w:rFonts w:ascii="Montserrat" w:hAnsi="Montserrat" w:cs="Calibri"/>
+                <w:color w:val="2D2D2D"/>
                 <w:b/>
                 <w:bCs/>
                 <w:sz w:val="20"/>
@@ -672,19 +675,11 @@
           <w:p>
             <w:pPr>
               <w:spacing w:before="0" w:after="0"/>
-              <w:rPr>
-                <w:rFonts w:ascii="Calibri" w:hAnsi="Calibri" w:cs="Calibri"/>
-                <w:color w:val="2B6CB0"/>
-                <w:i/>
-                <w:iCs/>
-                <w:sz w:val="18"/>
-                <w:szCs w:val="18"/>
-              </w:rPr>
             </w:pPr>
             <w:r>
               <w:rPr>
-                <w:rFonts w:ascii="Calibri" w:hAnsi="Calibri" w:cs="Calibri"/>
-                <w:color w:val="2B6CB0"/>
+                <w:rFonts w:ascii="Montserrat" w:hAnsi="Montserrat" w:cs="Calibri"/>
+                <w:color w:val="4472C4"/>
                 <w:i/>
                 <w:iCs/>
                 <w:sz w:val="18"/>
@@ -712,17 +707,11 @@
           <w:p>
             <w:pPr>
               <w:spacing w:before="0" w:after="0"/>
-              <w:rPr>
-                <w:rFonts w:ascii="Calibri" w:hAnsi="Calibri" w:cs="Calibri"/>
-                <w:color w:val="4A5568"/>
-                <w:sz w:val="18"/>
-                <w:szCs w:val="18"/>
-              </w:rPr>
             </w:pPr>
             <w:r>
               <w:rPr>
-                <w:rFonts w:ascii="Calibri" w:hAnsi="Calibri" w:cs="Calibri"/>
-                <w:color w:val="4A5568"/>
+                <w:rFonts w:ascii="Montserrat" w:hAnsi="Montserrat" w:cs="Calibri"/>
+                <w:color w:val="555555"/>
                 <w:sz w:val="18"/>
                 <w:szCs w:val="18"/>
               </w:rPr>
@@ -740,17 +729,11 @@
           <w:p>
             <w:pPr>
               <w:spacing w:before="0" w:after="0"/>
-              <w:rPr>
-                <w:rFonts w:ascii="Calibri" w:hAnsi="Calibri" w:cs="Calibri"/>
-                <w:color w:val="4A5568"/>
-                <w:sz w:val="18"/>
-                <w:szCs w:val="18"/>
-              </w:rPr>
             </w:pPr>
             <w:r>
               <w:rPr>
-                <w:rFonts w:ascii="Calibri" w:hAnsi="Calibri" w:cs="Calibri"/>
-                <w:color w:val="4A5568"/>
+                <w:rFonts w:ascii="Montserrat" w:hAnsi="Montserrat" w:cs="Calibri"/>
+                <w:color w:val="555555"/>
                 <w:sz w:val="18"/>
                 <w:szCs w:val="18"/>
               </w:rPr>
@@ -781,44 +764,30 @@
           <w:p>
             <w:pPr>
               <w:pBdr>
-                <w:bottom w:val="single" w:sz="6" w:space="1" w:color="2B6CB0"/>
+                <w:bottom w:val="single" w:sz="6" w:space="1" w:color="4472C4"/>
               </w:pBdr>
               <w:spacing w:before="280" w:after="80"/>
+            </w:pPr>
+            <w:r>
               <w:rPr>
-                <w:rFonts w:ascii="Calibri" w:hAnsi="Calibri" w:cs="Calibri"/>
-                <w:color w:val="2B6CB0"/>
+                <w:rFonts w:ascii="Montserrat" w:hAnsi="Montserrat" w:cs="Calibri"/>
+                <w:color w:val="4472C4"/>
                 <w:b/>
                 <w:bCs/>
                 <w:sz w:val="24"/>
                 <w:szCs w:val="24"/>
               </w:rPr>
-            </w:pPr>
-            <w:r>
-              <w:rPr>
-                <w:rFonts w:ascii="Calibri" w:hAnsi="Calibri" w:cs="Calibri"/>
-                <w:color w:val="2B6CB0"/>
-                <w:b/>
-                <w:bCs/>
-                <w:sz w:val="24"/>
-                <w:szCs w:val="24"/>
-              </w:rPr>
-              <w:t xml:space="preserve">ΔΗΜΟΣΙΕΥΣΕΙΣ</w:t>
+              <w:t xml:space="preserve">Publications</w:t>
             </w:r>
           </w:p>
           <w:p>
             <w:pPr>
               <w:spacing w:before="0" w:after="0"/>
-              <w:rPr>
-                <w:rFonts w:ascii="Calibri" w:hAnsi="Calibri" w:cs="Calibri"/>
-                <w:color w:val="4A5568"/>
-                <w:sz w:val="18"/>
-                <w:szCs w:val="18"/>
-              </w:rPr>
             </w:pPr>
             <w:r>
               <w:rPr>
-                <w:rFonts w:ascii="Calibri" w:hAnsi="Calibri" w:cs="Calibri"/>
-                <w:color w:val="4A5568"/>
+                <w:rFonts w:ascii="Montserrat" w:hAnsi="Montserrat" w:cs="Calibri"/>
+                <w:color w:val="555555"/>
                 <w:sz w:val="18"/>
                 <w:szCs w:val="18"/>
               </w:rPr>

</xml_diff>